<commit_message>
finished exercise set 3 for logic
</commit_message>
<xml_diff>
--- a/Fall-2025/logic-for-cs/exercise-set-3.docx
+++ b/Fall-2025/logic-for-cs/exercise-set-3.docx
@@ -113,7 +113,15 @@
         </w:rPr>
       </w:pPr>
       <w:r>
-        <w:t>{p(a), q(a, a), q(a, b), q(a, c), q(b, a), q(b, b), q(b, c), q(c, a), q(c, b), q(c, c), r(a), r(b), r(c)}</w:t>
+        <w:t xml:space="preserve">{p(a), q(a, a), q(a, b), q(a, c), q(b, a), q(b, b), q(b, c), q(c, a), q(c, b), q(c, </w:t>
+      </w:r>
+      <w:proofErr w:type="gramStart"/>
+      <w:r>
+        <w:t>c), r(a</w:t>
+      </w:r>
+      <w:proofErr w:type="gramEnd"/>
+      <w:r>
+        <w:t>), r(b), r(c)}</w:t>
       </w:r>
     </w:p>
     <w:p>
@@ -228,7 +236,7 @@
         <w:pStyle w:val="BodyText"/>
         <w:spacing w:line="480" w:lineRule="auto"/>
         <w:rPr>
-          <w:rFonts w:eastAsia="MS Mincho"/>
+          <w:rFonts w:eastAsia="MS Mincho" w:hint="eastAsia"/>
           <w:bCs/>
           <w:lang w:eastAsia="ja-JP"/>
         </w:rPr>
@@ -383,31 +391,7 @@
           <w:bCs/>
           <w:lang w:eastAsia="ja-JP"/>
         </w:rPr>
-        <w:t>(</w:t>
-      </w:r>
-      <w:r>
-        <w:rPr>
-          <w:rFonts w:eastAsia="MS Mincho" w:hint="eastAsia"/>
-          <w:bCs/>
-          <w:lang w:eastAsia="ja-JP"/>
-        </w:rPr>
-        <w:t>m, n</w:t>
-      </w:r>
-      <w:r>
-        <w:rPr>
-          <w:rFonts w:eastAsia="MS Mincho" w:hint="eastAsia"/>
-          <w:bCs/>
-          <w:lang w:eastAsia="ja-JP"/>
-        </w:rPr>
-        <w:t>)</w:t>
-      </w:r>
-      <w:r>
-        <w:rPr>
-          <w:rFonts w:eastAsia="MS Mincho" w:hint="eastAsia"/>
-          <w:bCs/>
-          <w:lang w:eastAsia="ja-JP"/>
-        </w:rPr>
-        <w:t xml:space="preserve">, </w:t>
+        <w:t xml:space="preserve">(m, n), </w:t>
       </w:r>
       <w:proofErr w:type="spellStart"/>
       <w:r>
@@ -485,23 +469,7 @@
           <w:bCs/>
           <w:lang w:eastAsia="ja-JP"/>
         </w:rPr>
-        <w:t>(</w:t>
-      </w:r>
-      <w:r>
-        <w:rPr>
-          <w:rFonts w:eastAsia="MS Mincho" w:hint="eastAsia"/>
-          <w:bCs/>
-          <w:lang w:eastAsia="ja-JP"/>
-        </w:rPr>
-        <w:t>m, n</w:t>
-      </w:r>
-      <w:r>
-        <w:rPr>
-          <w:rFonts w:eastAsia="MS Mincho" w:hint="eastAsia"/>
-          <w:bCs/>
-          <w:lang w:eastAsia="ja-JP"/>
-        </w:rPr>
-        <w:t xml:space="preserve">), </w:t>
+        <w:t xml:space="preserve">(m, n), </w:t>
       </w:r>
       <w:proofErr w:type="spellStart"/>
       <w:r>
@@ -519,31 +487,7 @@
           <w:bCs/>
           <w:lang w:eastAsia="ja-JP"/>
         </w:rPr>
-        <w:t>(</w:t>
-      </w:r>
-      <w:r>
-        <w:rPr>
-          <w:rFonts w:eastAsia="MS Mincho" w:hint="eastAsia"/>
-          <w:bCs/>
-          <w:lang w:eastAsia="ja-JP"/>
-        </w:rPr>
-        <w:t>m, n</w:t>
-      </w:r>
-      <w:r>
-        <w:rPr>
-          <w:rFonts w:eastAsia="MS Mincho" w:hint="eastAsia"/>
-          <w:bCs/>
-          <w:lang w:eastAsia="ja-JP"/>
-        </w:rPr>
-        <w:t>)</w:t>
-      </w:r>
-      <w:r>
-        <w:rPr>
-          <w:rFonts w:eastAsia="MS Mincho" w:hint="eastAsia"/>
-          <w:bCs/>
-          <w:lang w:eastAsia="ja-JP"/>
-        </w:rPr>
-        <w:t xml:space="preserve">, </w:t>
+        <w:t xml:space="preserve">(m, n), </w:t>
       </w:r>
       <w:proofErr w:type="spellStart"/>
       <w:r>
@@ -657,7 +601,7 @@
         <w:pStyle w:val="BodyText"/>
         <w:spacing w:line="480" w:lineRule="auto"/>
         <w:rPr>
-          <w:rFonts w:eastAsia="MS Mincho"/>
+          <w:rFonts w:eastAsia="MS Mincho" w:hint="eastAsia"/>
           <w:b/>
           <w:lang w:eastAsia="ja-JP"/>
         </w:rPr>
@@ -668,7 +612,7 @@
         <w:pStyle w:val="BodyText"/>
         <w:spacing w:line="480" w:lineRule="auto"/>
         <w:rPr>
-          <w:rFonts w:eastAsia="MS Mincho"/>
+          <w:rFonts w:eastAsia="MS Mincho" w:hint="eastAsia"/>
           <w:b/>
           <w:lang w:eastAsia="ja-JP"/>
         </w:rPr>
@@ -679,7 +623,7 @@
         <w:pStyle w:val="BodyText"/>
         <w:spacing w:line="480" w:lineRule="auto"/>
         <w:rPr>
-          <w:rFonts w:eastAsia="MS Mincho"/>
+          <w:rFonts w:eastAsia="MS Mincho" w:hint="eastAsia"/>
           <w:b/>
           <w:lang w:eastAsia="ja-JP"/>
         </w:rPr>
@@ -699,7 +643,7 @@
         <w:pStyle w:val="BodyText"/>
         <w:spacing w:line="480" w:lineRule="auto"/>
         <w:rPr>
-          <w:rFonts w:eastAsia="MS Mincho"/>
+          <w:rFonts w:eastAsia="MS Mincho" w:hint="eastAsia"/>
           <w:bCs/>
           <w:lang w:eastAsia="ja-JP"/>
         </w:rPr>
@@ -866,6 +810,719 @@
           <w:lang w:eastAsia="ja-JP"/>
         </w:rPr>
         <w:t>Exercise 22</w:t>
+      </w:r>
+      <w:r>
+        <w:rPr>
+          <w:rFonts w:eastAsia="MS Mincho"/>
+          <w:b/>
+          <w:lang w:eastAsia="ja-JP"/>
+        </w:rPr>
+        <w:t xml:space="preserve"> </w:t>
+      </w:r>
+      <w:r>
+        <w:rPr>
+          <w:rFonts w:eastAsia="MS Mincho"/>
+          <w:bCs/>
+          <w:lang w:eastAsia="ja-JP"/>
+        </w:rPr>
+        <w:t>(assuming you meant exercise 10 instead of 11?)</w:t>
+      </w:r>
+    </w:p>
+    <w:p>
+      <w:pPr>
+        <w:pStyle w:val="BodyText"/>
+        <w:spacing w:line="480" w:lineRule="auto"/>
+        <w:rPr>
+          <w:rFonts w:eastAsia="MS Mincho" w:hint="eastAsia"/>
+          <w:bCs/>
+          <w:lang w:eastAsia="ja-JP"/>
+        </w:rPr>
+      </w:pPr>
+      <w:r>
+        <w:rPr>
+          <w:rFonts w:eastAsia="MS Mincho"/>
+          <w:bCs/>
+          <w:lang w:eastAsia="ja-JP"/>
+        </w:rPr>
+        <w:t xml:space="preserve">T P ↑ </w:t>
+      </w:r>
+      <w:r>
+        <w:rPr>
+          <w:rFonts w:eastAsia="MS Mincho"/>
+          <w:bCs/>
+          <w:lang w:eastAsia="ja-JP"/>
+        </w:rPr>
+        <w:t xml:space="preserve">0 = </w:t>
+      </w:r>
+      <w:r>
+        <w:rPr>
+          <w:rFonts w:ascii="Cambria Math" w:eastAsia="MS Mincho" w:hAnsi="Cambria Math" w:cs="Cambria Math"/>
+          <w:bCs/>
+          <w:lang w:eastAsia="ja-JP"/>
+        </w:rPr>
+        <w:t>∅</w:t>
+      </w:r>
+      <w:r>
+        <w:rPr>
+          <w:rFonts w:ascii="Cambria Math" w:eastAsia="MS Mincho" w:hAnsi="Cambria Math" w:cs="Cambria Math"/>
+          <w:bCs/>
+          <w:lang w:eastAsia="ja-JP"/>
+        </w:rPr>
+        <w:t xml:space="preserve">; </w:t>
+      </w:r>
+      <w:r>
+        <w:rPr>
+          <w:rFonts w:eastAsia="MS Mincho"/>
+          <w:bCs/>
+          <w:lang w:eastAsia="ja-JP"/>
+        </w:rPr>
+        <w:t xml:space="preserve">T P ↑ </w:t>
+      </w:r>
+      <w:r>
+        <w:rPr>
+          <w:rFonts w:eastAsia="MS Mincho"/>
+          <w:bCs/>
+          <w:lang w:eastAsia="ja-JP"/>
+        </w:rPr>
+        <w:t>1</w:t>
+      </w:r>
+      <w:r>
+        <w:rPr>
+          <w:rFonts w:eastAsia="MS Mincho" w:hint="eastAsia"/>
+          <w:bCs/>
+          <w:lang w:eastAsia="ja-JP"/>
+        </w:rPr>
+        <w:t xml:space="preserve"> = {</w:t>
+      </w:r>
+      <w:r>
+        <w:rPr>
+          <w:rFonts w:eastAsia="MS Mincho"/>
+          <w:bCs/>
+          <w:lang w:eastAsia="ja-JP"/>
+        </w:rPr>
+        <w:t>q</w:t>
+      </w:r>
+      <w:r>
+        <w:rPr>
+          <w:rFonts w:eastAsia="MS Mincho"/>
+          <w:bCs/>
+          <w:lang w:eastAsia="ja-JP"/>
+        </w:rPr>
+        <w:t>(a), q(</w:t>
+      </w:r>
+      <w:r>
+        <w:rPr>
+          <w:rFonts w:eastAsia="MS Mincho"/>
+          <w:bCs/>
+          <w:lang w:eastAsia="ja-JP"/>
+        </w:rPr>
+        <w:t>c), p(b)</w:t>
+      </w:r>
+      <w:r>
+        <w:rPr>
+          <w:rFonts w:eastAsia="MS Mincho" w:hint="eastAsia"/>
+          <w:bCs/>
+          <w:lang w:eastAsia="ja-JP"/>
+        </w:rPr>
+        <w:t xml:space="preserve">}; </w:t>
+      </w:r>
+      <w:r>
+        <w:rPr>
+          <w:rFonts w:eastAsia="MS Mincho"/>
+          <w:bCs/>
+          <w:lang w:eastAsia="ja-JP"/>
+        </w:rPr>
+        <w:t xml:space="preserve">T P ↑ </w:t>
+      </w:r>
+      <w:r>
+        <w:rPr>
+          <w:rFonts w:eastAsia="MS Mincho"/>
+          <w:bCs/>
+          <w:lang w:eastAsia="ja-JP"/>
+        </w:rPr>
+        <w:t>2</w:t>
+      </w:r>
+      <w:r>
+        <w:rPr>
+          <w:rFonts w:eastAsia="MS Mincho" w:hint="eastAsia"/>
+          <w:bCs/>
+          <w:lang w:eastAsia="ja-JP"/>
+        </w:rPr>
+        <w:t xml:space="preserve"> = {</w:t>
+      </w:r>
+      <w:r>
+        <w:rPr>
+          <w:rFonts w:eastAsia="MS Mincho"/>
+          <w:bCs/>
+          <w:lang w:eastAsia="ja-JP"/>
+        </w:rPr>
+        <w:t>q(a), q(c), p(b)</w:t>
+      </w:r>
+      <w:r>
+        <w:rPr>
+          <w:rFonts w:eastAsia="MS Mincho"/>
+          <w:bCs/>
+          <w:lang w:eastAsia="ja-JP"/>
+        </w:rPr>
+        <w:t>, p(a), p(c)</w:t>
+      </w:r>
+      <w:r>
+        <w:rPr>
+          <w:rFonts w:eastAsia="MS Mincho" w:hint="eastAsia"/>
+          <w:bCs/>
+          <w:lang w:eastAsia="ja-JP"/>
+        </w:rPr>
+        <w:t>};</w:t>
+      </w:r>
+      <w:r>
+        <w:rPr>
+          <w:rFonts w:eastAsia="MS Mincho"/>
+          <w:bCs/>
+          <w:lang w:eastAsia="ja-JP"/>
+        </w:rPr>
+        <w:t xml:space="preserve"> </w:t>
+      </w:r>
+      <w:r>
+        <w:rPr>
+          <w:rFonts w:eastAsia="MS Mincho"/>
+          <w:bCs/>
+          <w:lang w:eastAsia="ja-JP"/>
+        </w:rPr>
+        <w:t xml:space="preserve">T P ↑ </w:t>
+      </w:r>
+      <w:r>
+        <w:rPr>
+          <w:rFonts w:eastAsia="MS Mincho"/>
+          <w:bCs/>
+          <w:lang w:eastAsia="ja-JP"/>
+        </w:rPr>
+        <w:t>3</w:t>
+      </w:r>
+      <w:r>
+        <w:rPr>
+          <w:rFonts w:eastAsia="MS Mincho" w:hint="eastAsia"/>
+          <w:bCs/>
+          <w:lang w:eastAsia="ja-JP"/>
+        </w:rPr>
+        <w:t xml:space="preserve"> = {</w:t>
+      </w:r>
+      <w:r>
+        <w:rPr>
+          <w:rFonts w:eastAsia="MS Mincho"/>
+          <w:bCs/>
+          <w:lang w:eastAsia="ja-JP"/>
+        </w:rPr>
+        <w:t>q(a), q(c), p(b)</w:t>
+      </w:r>
+      <w:r>
+        <w:rPr>
+          <w:rFonts w:eastAsia="MS Mincho"/>
+          <w:bCs/>
+          <w:lang w:eastAsia="ja-JP"/>
+        </w:rPr>
+        <w:t>, p(a), p(c), r(b)</w:t>
+      </w:r>
+      <w:r>
+        <w:rPr>
+          <w:rFonts w:eastAsia="MS Mincho" w:hint="eastAsia"/>
+          <w:bCs/>
+          <w:lang w:eastAsia="ja-JP"/>
+        </w:rPr>
+        <w:t xml:space="preserve">};  </w:t>
+      </w:r>
+      <w:r>
+        <w:rPr>
+          <w:rFonts w:eastAsia="MS Mincho"/>
+          <w:bCs/>
+          <w:lang w:eastAsia="ja-JP"/>
+        </w:rPr>
+        <w:t xml:space="preserve"> </w:t>
+      </w:r>
+      <w:r>
+        <w:rPr>
+          <w:rFonts w:eastAsia="MS Mincho"/>
+          <w:bCs/>
+          <w:lang w:eastAsia="ja-JP"/>
+        </w:rPr>
+        <w:t>T P ↑ ω</w:t>
+      </w:r>
+      <w:r>
+        <w:rPr>
+          <w:rFonts w:eastAsia="MS Mincho" w:hint="eastAsia"/>
+          <w:bCs/>
+          <w:lang w:eastAsia="ja-JP"/>
+        </w:rPr>
+        <w:t xml:space="preserve"> = {</w:t>
+      </w:r>
+      <w:r>
+        <w:rPr>
+          <w:rFonts w:eastAsia="MS Mincho"/>
+          <w:bCs/>
+          <w:lang w:eastAsia="ja-JP"/>
+        </w:rPr>
+        <w:t>q(a), q(c), p(b), p(a), p(c), r(b)</w:t>
+      </w:r>
+      <w:r>
+        <w:rPr>
+          <w:rFonts w:eastAsia="MS Mincho"/>
+          <w:bCs/>
+          <w:lang w:eastAsia="ja-JP"/>
+        </w:rPr>
+        <w:t>}</w:t>
+      </w:r>
+    </w:p>
+    <w:p>
+      <w:pPr>
+        <w:pStyle w:val="BodyText"/>
+        <w:spacing w:line="480" w:lineRule="auto"/>
+        <w:rPr>
+          <w:rFonts w:eastAsia="MS Mincho" w:hint="eastAsia"/>
+          <w:bCs/>
+          <w:lang w:eastAsia="ja-JP"/>
+        </w:rPr>
+      </w:pPr>
+      <w:r>
+        <w:rPr>
+          <w:rFonts w:eastAsia="MS Mincho"/>
+          <w:b/>
+          <w:lang w:eastAsia="ja-JP"/>
+        </w:rPr>
+        <w:t>Exercise 23</w:t>
+      </w:r>
+    </w:p>
+    <w:p>
+      <w:pPr>
+        <w:pStyle w:val="BodyText"/>
+        <w:spacing w:line="480" w:lineRule="auto"/>
+        <w:rPr>
+          <w:rFonts w:eastAsia="MS Mincho" w:hint="eastAsia"/>
+          <w:bCs/>
+          <w:lang w:eastAsia="ja-JP"/>
+        </w:rPr>
+      </w:pPr>
+      <w:r>
+        <w:rPr>
+          <w:rFonts w:eastAsia="MS Mincho"/>
+          <w:bCs/>
+          <w:lang w:eastAsia="ja-JP"/>
+        </w:rPr>
+        <w:t xml:space="preserve">T P ↑ </w:t>
+      </w:r>
+      <w:r>
+        <w:rPr>
+          <w:rFonts w:eastAsia="MS Mincho"/>
+          <w:bCs/>
+          <w:lang w:eastAsia="ja-JP"/>
+        </w:rPr>
+        <w:t xml:space="preserve">0 = </w:t>
+      </w:r>
+      <w:r>
+        <w:rPr>
+          <w:rFonts w:ascii="Cambria Math" w:eastAsia="MS Mincho" w:hAnsi="Cambria Math" w:cs="Cambria Math"/>
+          <w:bCs/>
+          <w:lang w:eastAsia="ja-JP"/>
+        </w:rPr>
+        <w:t>∅</w:t>
+      </w:r>
+      <w:r>
+        <w:rPr>
+          <w:rFonts w:ascii="Cambria Math" w:eastAsia="MS Mincho" w:hAnsi="Cambria Math" w:cs="Cambria Math"/>
+          <w:bCs/>
+          <w:lang w:eastAsia="ja-JP"/>
+        </w:rPr>
+        <w:t xml:space="preserve">; </w:t>
+      </w:r>
+      <w:r>
+        <w:rPr>
+          <w:rFonts w:eastAsia="MS Mincho"/>
+          <w:bCs/>
+          <w:lang w:eastAsia="ja-JP"/>
+        </w:rPr>
+        <w:t xml:space="preserve">T P ↑ </w:t>
+      </w:r>
+      <w:r>
+        <w:rPr>
+          <w:rFonts w:eastAsia="MS Mincho"/>
+          <w:bCs/>
+          <w:lang w:eastAsia="ja-JP"/>
+        </w:rPr>
+        <w:t>1</w:t>
+      </w:r>
+      <w:r>
+        <w:rPr>
+          <w:rFonts w:eastAsia="MS Mincho" w:hint="eastAsia"/>
+          <w:bCs/>
+          <w:lang w:eastAsia="ja-JP"/>
+        </w:rPr>
+        <w:t xml:space="preserve"> = {</w:t>
+      </w:r>
+      <w:r>
+        <w:rPr>
+          <w:rFonts w:eastAsia="MS Mincho"/>
+          <w:bCs/>
+          <w:lang w:eastAsia="ja-JP"/>
+        </w:rPr>
+        <w:t>p(a), q(b)</w:t>
+      </w:r>
+      <w:r>
+        <w:rPr>
+          <w:rFonts w:eastAsia="MS Mincho" w:hint="eastAsia"/>
+          <w:bCs/>
+          <w:lang w:eastAsia="ja-JP"/>
+        </w:rPr>
+        <w:t xml:space="preserve">}; </w:t>
+      </w:r>
+      <w:r>
+        <w:rPr>
+          <w:rFonts w:eastAsia="MS Mincho"/>
+          <w:bCs/>
+          <w:lang w:eastAsia="ja-JP"/>
+        </w:rPr>
+        <w:t>T P ↑ ω</w:t>
+      </w:r>
+      <w:r>
+        <w:rPr>
+          <w:rFonts w:eastAsia="MS Mincho" w:hint="eastAsia"/>
+          <w:bCs/>
+          <w:lang w:eastAsia="ja-JP"/>
+        </w:rPr>
+        <w:t xml:space="preserve"> = {</w:t>
+      </w:r>
+      <w:r>
+        <w:rPr>
+          <w:rFonts w:eastAsia="MS Mincho"/>
+          <w:bCs/>
+          <w:lang w:eastAsia="ja-JP"/>
+        </w:rPr>
+        <w:t>p(a, b), q(b)</w:t>
+      </w:r>
+      <w:r>
+        <w:rPr>
+          <w:rFonts w:eastAsia="MS Mincho" w:hint="eastAsia"/>
+          <w:bCs/>
+          <w:lang w:eastAsia="ja-JP"/>
+        </w:rPr>
+        <w:t>}</w:t>
+      </w:r>
+    </w:p>
+    <w:p>
+      <w:pPr>
+        <w:pStyle w:val="BodyText"/>
+        <w:spacing w:line="480" w:lineRule="auto"/>
+        <w:rPr>
+          <w:rFonts w:eastAsia="MS Mincho" w:hint="eastAsia"/>
+          <w:bCs/>
+          <w:lang w:eastAsia="ja-JP"/>
+        </w:rPr>
+      </w:pPr>
+      <w:r>
+        <w:rPr>
+          <w:rFonts w:eastAsia="MS Mincho"/>
+          <w:b/>
+          <w:lang w:eastAsia="ja-JP"/>
+        </w:rPr>
+        <w:t>Exercise 24</w:t>
+      </w:r>
+    </w:p>
+    <w:p>
+      <w:pPr>
+        <w:pStyle w:val="BodyText"/>
+        <w:spacing w:line="480" w:lineRule="auto"/>
+        <w:rPr>
+          <w:rFonts w:eastAsia="MS Mincho" w:hint="eastAsia"/>
+          <w:bCs/>
+          <w:lang w:eastAsia="ja-JP"/>
+        </w:rPr>
+      </w:pPr>
+      <w:r>
+        <w:rPr>
+          <w:rFonts w:eastAsia="MS Mincho"/>
+          <w:bCs/>
+          <w:lang w:eastAsia="ja-JP"/>
+        </w:rPr>
+        <w:t xml:space="preserve">T P ↑ 0 = </w:t>
+      </w:r>
+      <w:r>
+        <w:rPr>
+          <w:rFonts w:ascii="Cambria Math" w:eastAsia="MS Mincho" w:hAnsi="Cambria Math" w:cs="Cambria Math"/>
+          <w:bCs/>
+          <w:lang w:eastAsia="ja-JP"/>
+        </w:rPr>
+        <w:t>∅</w:t>
+      </w:r>
+    </w:p>
+    <w:p>
+      <w:pPr>
+        <w:pStyle w:val="BodyText"/>
+        <w:spacing w:line="480" w:lineRule="auto"/>
+        <w:rPr>
+          <w:rFonts w:eastAsia="MS Mincho" w:hint="eastAsia"/>
+          <w:bCs/>
+          <w:lang w:eastAsia="ja-JP"/>
+        </w:rPr>
+      </w:pPr>
+      <w:r>
+        <w:rPr>
+          <w:rFonts w:eastAsia="MS Mincho"/>
+          <w:bCs/>
+          <w:lang w:eastAsia="ja-JP"/>
+        </w:rPr>
+        <w:t xml:space="preserve">T P ↑ 1 = {p(a, b), </w:t>
+      </w:r>
+      <w:r>
+        <w:rPr>
+          <w:rFonts w:eastAsia="MS Mincho"/>
+          <w:bCs/>
+          <w:lang w:eastAsia="ja-JP"/>
+        </w:rPr>
+        <w:t>p(b, c), p(c, a), p(d, d)</w:t>
+      </w:r>
+      <w:r>
+        <w:rPr>
+          <w:rFonts w:eastAsia="MS Mincho"/>
+          <w:bCs/>
+          <w:lang w:eastAsia="ja-JP"/>
+        </w:rPr>
+        <w:t>}</w:t>
+      </w:r>
+    </w:p>
+    <w:p>
+      <w:pPr>
+        <w:pStyle w:val="BodyText"/>
+        <w:spacing w:line="480" w:lineRule="auto"/>
+        <w:rPr>
+          <w:rFonts w:eastAsia="MS Mincho" w:hint="eastAsia"/>
+          <w:bCs/>
+          <w:lang w:eastAsia="ja-JP"/>
+        </w:rPr>
+      </w:pPr>
+      <w:r>
+        <w:rPr>
+          <w:rFonts w:eastAsia="MS Mincho"/>
+          <w:bCs/>
+          <w:lang w:eastAsia="ja-JP"/>
+        </w:rPr>
+        <w:t xml:space="preserve">T P ↑ 2 = {p(a, b), </w:t>
+      </w:r>
+      <w:r>
+        <w:rPr>
+          <w:rFonts w:eastAsia="MS Mincho"/>
+          <w:bCs/>
+          <w:lang w:eastAsia="ja-JP"/>
+        </w:rPr>
+        <w:t>p(b, c), p(c, a), p(d, d), q(a, b), q(b, c), q(c, a), q(d, d)</w:t>
+      </w:r>
+      <w:r>
+        <w:rPr>
+          <w:rFonts w:eastAsia="MS Mincho"/>
+          <w:bCs/>
+          <w:lang w:eastAsia="ja-JP"/>
+        </w:rPr>
+        <w:t>}</w:t>
+      </w:r>
+    </w:p>
+    <w:p>
+      <w:pPr>
+        <w:pStyle w:val="BodyText"/>
+        <w:spacing w:line="480" w:lineRule="auto"/>
+        <w:rPr>
+          <w:rFonts w:eastAsia="MS Mincho" w:hint="eastAsia"/>
+          <w:bCs/>
+          <w:lang w:eastAsia="ja-JP"/>
+        </w:rPr>
+      </w:pPr>
+      <w:r>
+        <w:rPr>
+          <w:rFonts w:eastAsia="MS Mincho"/>
+          <w:bCs/>
+          <w:lang w:eastAsia="ja-JP"/>
+        </w:rPr>
+        <w:t xml:space="preserve">T P ↑ </w:t>
+      </w:r>
+      <w:r>
+        <w:rPr>
+          <w:rFonts w:eastAsia="MS Mincho"/>
+          <w:bCs/>
+          <w:lang w:eastAsia="ja-JP"/>
+        </w:rPr>
+        <w:t>3</w:t>
+      </w:r>
+      <w:r>
+        <w:rPr>
+          <w:rFonts w:eastAsia="MS Mincho"/>
+          <w:bCs/>
+          <w:lang w:eastAsia="ja-JP"/>
+        </w:rPr>
+        <w:t xml:space="preserve"> = {p(a, b), </w:t>
+      </w:r>
+      <w:r>
+        <w:rPr>
+          <w:rFonts w:eastAsia="MS Mincho"/>
+          <w:bCs/>
+          <w:lang w:eastAsia="ja-JP"/>
+        </w:rPr>
+        <w:t>p(b, c), p(c, a), p(d, d), q(a, b), q(b, c), q(c, a), q(d, d), q(a, c), q(b, a), q(c, b)</w:t>
+      </w:r>
+      <w:r>
+        <w:rPr>
+          <w:rFonts w:eastAsia="MS Mincho"/>
+          <w:bCs/>
+          <w:lang w:eastAsia="ja-JP"/>
+        </w:rPr>
+        <w:t>, r(a, b), r(b, c), r(c, a), r(d, d)</w:t>
+      </w:r>
+      <w:r>
+        <w:rPr>
+          <w:rFonts w:eastAsia="MS Mincho"/>
+          <w:bCs/>
+          <w:lang w:eastAsia="ja-JP"/>
+        </w:rPr>
+        <w:t>}</w:t>
+      </w:r>
+    </w:p>
+    <w:p>
+      <w:pPr>
+        <w:pStyle w:val="BodyText"/>
+        <w:spacing w:line="480" w:lineRule="auto"/>
+        <w:rPr>
+          <w:rFonts w:eastAsia="MS Mincho" w:hint="eastAsia"/>
+          <w:bCs/>
+          <w:lang w:eastAsia="ja-JP"/>
+        </w:rPr>
+      </w:pPr>
+      <w:r>
+        <w:rPr>
+          <w:rFonts w:eastAsia="MS Mincho"/>
+          <w:bCs/>
+          <w:lang w:eastAsia="ja-JP"/>
+        </w:rPr>
+        <w:t xml:space="preserve">T P ↑ </w:t>
+      </w:r>
+      <w:r>
+        <w:rPr>
+          <w:rFonts w:eastAsia="MS Mincho"/>
+          <w:bCs/>
+          <w:lang w:eastAsia="ja-JP"/>
+        </w:rPr>
+        <w:t>4</w:t>
+      </w:r>
+      <w:r>
+        <w:rPr>
+          <w:rFonts w:eastAsia="MS Mincho"/>
+          <w:bCs/>
+          <w:lang w:eastAsia="ja-JP"/>
+        </w:rPr>
+        <w:t xml:space="preserve"> = {p(a, b), </w:t>
+      </w:r>
+      <w:r>
+        <w:rPr>
+          <w:rFonts w:eastAsia="MS Mincho"/>
+          <w:bCs/>
+          <w:lang w:eastAsia="ja-JP"/>
+        </w:rPr>
+        <w:t>p(b, c), p(c, a), p(d, d), q(a, b), q(b, c), q(c, a), q(d, d), q(a, c), q(b, a), q(c, b), r(a, b), r(b, c), r(c, a), r(d, d), r(a, c), r(b, a), r(c, b), r(b, a), r(c, b), r(a, c), t(d)</w:t>
+      </w:r>
+      <w:r>
+        <w:rPr>
+          <w:rFonts w:eastAsia="MS Mincho"/>
+          <w:bCs/>
+          <w:lang w:eastAsia="ja-JP"/>
+        </w:rPr>
+        <w:t>}</w:t>
+      </w:r>
+    </w:p>
+    <w:p>
+      <w:pPr>
+        <w:pStyle w:val="BodyText"/>
+        <w:spacing w:line="480" w:lineRule="auto"/>
+        <w:rPr>
+          <w:rFonts w:eastAsia="MS Mincho" w:hint="eastAsia"/>
+          <w:bCs/>
+          <w:lang w:eastAsia="ja-JP"/>
+        </w:rPr>
+      </w:pPr>
+      <w:r>
+        <w:rPr>
+          <w:rFonts w:eastAsia="MS Mincho"/>
+          <w:bCs/>
+          <w:lang w:eastAsia="ja-JP"/>
+        </w:rPr>
+        <w:t xml:space="preserve">T P ↑ </w:t>
+      </w:r>
+      <w:r>
+        <w:rPr>
+          <w:rFonts w:eastAsia="MS Mincho"/>
+          <w:bCs/>
+          <w:lang w:eastAsia="ja-JP"/>
+        </w:rPr>
+        <w:t>5</w:t>
+      </w:r>
+      <w:r>
+        <w:rPr>
+          <w:rFonts w:eastAsia="MS Mincho"/>
+          <w:bCs/>
+          <w:lang w:eastAsia="ja-JP"/>
+        </w:rPr>
+        <w:t xml:space="preserve"> = {p(a, b), </w:t>
+      </w:r>
+      <w:r>
+        <w:rPr>
+          <w:rFonts w:eastAsia="MS Mincho"/>
+          <w:bCs/>
+          <w:lang w:eastAsia="ja-JP"/>
+        </w:rPr>
+        <w:t>p(b, c), p(c, a), p(d, d), q(a, b), q(b, c), q(c, a), q(d, d), q(a, c), q(b, a), q(c, b), r(a, b), r(b, c), r(c, a), r(d, d), r(a, c), r(b, a), r(c, b), t(d)</w:t>
+      </w:r>
+      <w:r>
+        <w:rPr>
+          <w:rFonts w:eastAsia="MS Mincho"/>
+          <w:bCs/>
+          <w:lang w:eastAsia="ja-JP"/>
+        </w:rPr>
+        <w:t>}</w:t>
+      </w:r>
+    </w:p>
+    <w:p>
+      <w:pPr>
+        <w:pStyle w:val="BodyText"/>
+        <w:spacing w:line="480" w:lineRule="auto"/>
+        <w:rPr>
+          <w:rFonts w:eastAsia="MS Mincho"/>
+          <w:bCs/>
+          <w:lang w:eastAsia="ja-JP"/>
+        </w:rPr>
+      </w:pPr>
+      <w:r>
+        <w:rPr>
+          <w:rFonts w:eastAsia="MS Mincho"/>
+          <w:bCs/>
+          <w:lang w:eastAsia="ja-JP"/>
+        </w:rPr>
+        <w:t xml:space="preserve">T P ↑ ω = </w:t>
+      </w:r>
+      <w:r>
+        <w:rPr>
+          <w:rFonts w:eastAsia="MS Mincho"/>
+          <w:bCs/>
+          <w:lang w:eastAsia="ja-JP"/>
+        </w:rPr>
+        <w:t xml:space="preserve">{p(a, b), </w:t>
+      </w:r>
+      <w:r>
+        <w:rPr>
+          <w:rFonts w:eastAsia="MS Mincho"/>
+          <w:bCs/>
+          <w:lang w:eastAsia="ja-JP"/>
+        </w:rPr>
+        <w:t>p(b, c), p(c, a), p(d, d), q(a, b), q(b, c), q(c, a), q(d, d), q(a, c), q(b, a), q(c, b), r(a, b), r(b, c), r(c, a), r(d, d), r(a, c), r(b, a), r(c, b), t(d)</w:t>
+      </w:r>
+      <w:r>
+        <w:rPr>
+          <w:rFonts w:eastAsia="MS Mincho"/>
+          <w:bCs/>
+          <w:lang w:eastAsia="ja-JP"/>
+        </w:rPr>
+        <w:t>}</w:t>
       </w:r>
     </w:p>
     <w:p>
@@ -895,7 +1552,8 @@
           <w:b/>
           <w:lang w:eastAsia="ja-JP"/>
         </w:rPr>
-        <w:t>Exercise 23</w:t>
+        <w:lastRenderedPageBreak/>
+        <w:t>Exercise 25</w:t>
       </w:r>
     </w:p>
     <w:p>
@@ -903,7 +1561,7 @@
         <w:pStyle w:val="BodyText"/>
         <w:spacing w:line="480" w:lineRule="auto"/>
         <w:rPr>
-          <w:rFonts w:eastAsia="MS Mincho"/>
+          <w:rFonts w:eastAsia="MS Mincho" w:hint="eastAsia"/>
           <w:bCs/>
           <w:lang w:eastAsia="ja-JP"/>
         </w:rPr>
@@ -914,15 +1572,7 @@
           <w:bCs/>
           <w:lang w:eastAsia="ja-JP"/>
         </w:rPr>
-        <w:t xml:space="preserve">T P ↑ </w:t>
-      </w:r>
-      <w:r>
-        <w:rPr>
-          <w:rFonts w:eastAsia="MS Mincho"/>
-          <w:bCs/>
-          <w:lang w:eastAsia="ja-JP"/>
-        </w:rPr>
-        <w:t xml:space="preserve">0 = </w:t>
+        <w:t xml:space="preserve">T P ↑ 0 = </w:t>
       </w:r>
       <w:r>
         <w:rPr>
@@ -931,110 +1581,6 @@
           <w:lang w:eastAsia="ja-JP"/>
         </w:rPr>
         <w:t>∅</w:t>
-      </w:r>
-      <w:r>
-        <w:rPr>
-          <w:rFonts w:ascii="Cambria Math" w:eastAsia="MS Mincho" w:hAnsi="Cambria Math" w:cs="Cambria Math"/>
-          <w:bCs/>
-          <w:lang w:eastAsia="ja-JP"/>
-        </w:rPr>
-        <w:t xml:space="preserve">; </w:t>
-      </w:r>
-      <w:r>
-        <w:rPr>
-          <w:rFonts w:eastAsia="MS Mincho"/>
-          <w:bCs/>
-          <w:lang w:eastAsia="ja-JP"/>
-        </w:rPr>
-        <w:t xml:space="preserve">T P ↑ </w:t>
-      </w:r>
-      <w:r>
-        <w:rPr>
-          <w:rFonts w:eastAsia="MS Mincho"/>
-          <w:bCs/>
-          <w:lang w:eastAsia="ja-JP"/>
-        </w:rPr>
-        <w:t>1</w:t>
-      </w:r>
-      <w:r>
-        <w:rPr>
-          <w:rFonts w:eastAsia="MS Mincho" w:hint="eastAsia"/>
-          <w:bCs/>
-          <w:lang w:eastAsia="ja-JP"/>
-        </w:rPr>
-        <w:t xml:space="preserve"> = {</w:t>
-      </w:r>
-      <w:r>
-        <w:rPr>
-          <w:rFonts w:eastAsia="MS Mincho"/>
-          <w:bCs/>
-          <w:lang w:eastAsia="ja-JP"/>
-        </w:rPr>
-        <w:t>p(a), q(</w:t>
-      </w:r>
-      <w:r>
-        <w:rPr>
-          <w:rFonts w:eastAsia="MS Mincho"/>
-          <w:bCs/>
-          <w:lang w:eastAsia="ja-JP"/>
-        </w:rPr>
-        <w:t>b</w:t>
-      </w:r>
-      <w:r>
-        <w:rPr>
-          <w:rFonts w:eastAsia="MS Mincho"/>
-          <w:bCs/>
-          <w:lang w:eastAsia="ja-JP"/>
-        </w:rPr>
-        <w:t>)</w:t>
-      </w:r>
-      <w:r>
-        <w:rPr>
-          <w:rFonts w:eastAsia="MS Mincho" w:hint="eastAsia"/>
-          <w:bCs/>
-          <w:lang w:eastAsia="ja-JP"/>
-        </w:rPr>
-        <w:t xml:space="preserve">}; </w:t>
-      </w:r>
-      <w:r>
-        <w:rPr>
-          <w:rFonts w:eastAsia="MS Mincho"/>
-          <w:bCs/>
-          <w:lang w:eastAsia="ja-JP"/>
-        </w:rPr>
-        <w:t>T P ↑ ω</w:t>
-      </w:r>
-      <w:r>
-        <w:rPr>
-          <w:rFonts w:eastAsia="MS Mincho" w:hint="eastAsia"/>
-          <w:bCs/>
-          <w:lang w:eastAsia="ja-JP"/>
-        </w:rPr>
-        <w:t xml:space="preserve"> = {</w:t>
-      </w:r>
-      <w:r>
-        <w:rPr>
-          <w:rFonts w:eastAsia="MS Mincho"/>
-          <w:bCs/>
-          <w:lang w:eastAsia="ja-JP"/>
-        </w:rPr>
-        <w:t>p(a, b), q(</w:t>
-      </w:r>
-      <w:r>
-        <w:rPr>
-          <w:rFonts w:eastAsia="MS Mincho"/>
-          <w:bCs/>
-          <w:lang w:eastAsia="ja-JP"/>
-        </w:rPr>
-        <w:t>b)</w:t>
-      </w:r>
-      <w:r>
-        <w:rPr>
-          <w:rFonts w:eastAsia="MS Mincho" w:hint="eastAsia"/>
-          <w:bCs/>
-          <w:lang w:eastAsia="ja-JP"/>
-        </w:rPr>
-        <w:t>}</w:t>
       </w:r>
     </w:p>
     <w:p>
@@ -1050,10 +1596,516 @@
       <w:r>
         <w:rPr>
           <w:rFonts w:eastAsia="MS Mincho"/>
-          <w:b/>
-          <w:lang w:eastAsia="ja-JP"/>
-        </w:rPr>
-        <w:t>Exercise 24</w:t>
+          <w:bCs/>
+          <w:lang w:eastAsia="ja-JP"/>
+        </w:rPr>
+        <w:t>T P ↑ 1 =</w:t>
+      </w:r>
+      <w:r>
+        <w:rPr>
+          <w:rFonts w:eastAsia="MS Mincho"/>
+          <w:bCs/>
+          <w:lang w:eastAsia="ja-JP"/>
+        </w:rPr>
+        <w:t xml:space="preserve"> {</w:t>
+      </w:r>
+      <w:proofErr w:type="spellStart"/>
+      <w:r>
+        <w:rPr>
+          <w:rFonts w:eastAsia="MS Mincho"/>
+          <w:bCs/>
+          <w:lang w:eastAsia="ja-JP"/>
+        </w:rPr>
+        <w:t>motherOf</w:t>
+      </w:r>
+      <w:proofErr w:type="spellEnd"/>
+      <w:r>
+        <w:rPr>
+          <w:rFonts w:eastAsia="MS Mincho"/>
+          <w:bCs/>
+          <w:lang w:eastAsia="ja-JP"/>
+        </w:rPr>
+        <w:t>(</w:t>
+      </w:r>
+      <w:proofErr w:type="spellStart"/>
+      <w:r>
+        <w:rPr>
+          <w:rFonts w:eastAsia="MS Mincho"/>
+          <w:bCs/>
+          <w:lang w:eastAsia="ja-JP"/>
+        </w:rPr>
+        <w:t>marian</w:t>
+      </w:r>
+      <w:proofErr w:type="spellEnd"/>
+      <w:r>
+        <w:rPr>
+          <w:rFonts w:eastAsia="MS Mincho"/>
+          <w:bCs/>
+          <w:lang w:eastAsia="ja-JP"/>
+        </w:rPr>
+        <w:t xml:space="preserve">, </w:t>
+      </w:r>
+      <w:proofErr w:type="spellStart"/>
+      <w:r>
+        <w:rPr>
+          <w:rFonts w:eastAsia="MS Mincho"/>
+          <w:bCs/>
+          <w:lang w:eastAsia="ja-JP"/>
+        </w:rPr>
+        <w:t>michelle</w:t>
+      </w:r>
+      <w:proofErr w:type="spellEnd"/>
+      <w:r>
+        <w:rPr>
+          <w:rFonts w:eastAsia="MS Mincho"/>
+          <w:bCs/>
+          <w:lang w:eastAsia="ja-JP"/>
+        </w:rPr>
+        <w:t>)</w:t>
+      </w:r>
+      <w:r>
+        <w:rPr>
+          <w:rFonts w:eastAsia="MS Mincho"/>
+          <w:bCs/>
+          <w:lang w:eastAsia="ja-JP"/>
+        </w:rPr>
+        <w:t>,</w:t>
+      </w:r>
+      <w:r>
+        <w:rPr>
+          <w:rFonts w:eastAsia="MS Mincho"/>
+          <w:bCs/>
+          <w:lang w:eastAsia="ja-JP"/>
+        </w:rPr>
+        <w:t xml:space="preserve"> </w:t>
+      </w:r>
+      <w:proofErr w:type="spellStart"/>
+      <w:r>
+        <w:rPr>
+          <w:rFonts w:eastAsia="MS Mincho"/>
+          <w:bCs/>
+          <w:lang w:eastAsia="ja-JP"/>
+        </w:rPr>
+        <w:t>brotherOf</w:t>
+      </w:r>
+      <w:proofErr w:type="spellEnd"/>
+      <w:r>
+        <w:rPr>
+          <w:rFonts w:eastAsia="MS Mincho"/>
+          <w:bCs/>
+          <w:lang w:eastAsia="ja-JP"/>
+        </w:rPr>
+        <w:t xml:space="preserve">(craig, </w:t>
+      </w:r>
+      <w:proofErr w:type="spellStart"/>
+      <w:r>
+        <w:rPr>
+          <w:rFonts w:eastAsia="MS Mincho"/>
+          <w:bCs/>
+          <w:lang w:eastAsia="ja-JP"/>
+        </w:rPr>
+        <w:t>michelle</w:t>
+      </w:r>
+      <w:proofErr w:type="spellEnd"/>
+      <w:r>
+        <w:rPr>
+          <w:rFonts w:eastAsia="MS Mincho"/>
+          <w:bCs/>
+          <w:lang w:eastAsia="ja-JP"/>
+        </w:rPr>
+        <w:t>)</w:t>
+      </w:r>
+      <w:r>
+        <w:rPr>
+          <w:rFonts w:eastAsia="MS Mincho"/>
+          <w:bCs/>
+          <w:lang w:eastAsia="ja-JP"/>
+        </w:rPr>
+        <w:t>,</w:t>
+      </w:r>
+      <w:r>
+        <w:rPr>
+          <w:rFonts w:eastAsia="MS Mincho"/>
+          <w:bCs/>
+          <w:lang w:eastAsia="ja-JP"/>
+        </w:rPr>
+        <w:t xml:space="preserve"> </w:t>
+      </w:r>
+      <w:proofErr w:type="spellStart"/>
+      <w:r>
+        <w:rPr>
+          <w:rFonts w:eastAsia="MS Mincho"/>
+          <w:bCs/>
+          <w:lang w:eastAsia="ja-JP"/>
+        </w:rPr>
+        <w:t>motherOf</w:t>
+      </w:r>
+      <w:proofErr w:type="spellEnd"/>
+      <w:r>
+        <w:rPr>
+          <w:rFonts w:eastAsia="MS Mincho"/>
+          <w:bCs/>
+          <w:lang w:eastAsia="ja-JP"/>
+        </w:rPr>
+        <w:t>(</w:t>
+      </w:r>
+      <w:proofErr w:type="spellStart"/>
+      <w:r>
+        <w:rPr>
+          <w:rFonts w:eastAsia="MS Mincho"/>
+          <w:bCs/>
+          <w:lang w:eastAsia="ja-JP"/>
+        </w:rPr>
+        <w:t>ann</w:t>
+      </w:r>
+      <w:proofErr w:type="spellEnd"/>
+      <w:r>
+        <w:rPr>
+          <w:rFonts w:eastAsia="MS Mincho"/>
+          <w:bCs/>
+          <w:lang w:eastAsia="ja-JP"/>
+        </w:rPr>
+        <w:t xml:space="preserve">, </w:t>
+      </w:r>
+      <w:proofErr w:type="spellStart"/>
+      <w:r>
+        <w:rPr>
+          <w:rFonts w:eastAsia="MS Mincho"/>
+          <w:bCs/>
+          <w:lang w:eastAsia="ja-JP"/>
+        </w:rPr>
+        <w:t>barack</w:t>
+      </w:r>
+      <w:proofErr w:type="spellEnd"/>
+      <w:r>
+        <w:rPr>
+          <w:rFonts w:eastAsia="MS Mincho"/>
+          <w:bCs/>
+          <w:lang w:eastAsia="ja-JP"/>
+        </w:rPr>
+        <w:t>)</w:t>
+      </w:r>
+      <w:r>
+        <w:rPr>
+          <w:rFonts w:eastAsia="MS Mincho"/>
+          <w:bCs/>
+          <w:lang w:eastAsia="ja-JP"/>
+        </w:rPr>
+        <w:t xml:space="preserve">, </w:t>
+      </w:r>
+      <w:proofErr w:type="spellStart"/>
+      <w:r>
+        <w:rPr>
+          <w:rFonts w:eastAsia="MS Mincho"/>
+          <w:bCs/>
+          <w:lang w:eastAsia="ja-JP"/>
+        </w:rPr>
+        <w:t>fatherOf</w:t>
+      </w:r>
+      <w:proofErr w:type="spellEnd"/>
+      <w:r>
+        <w:rPr>
+          <w:rFonts w:eastAsia="MS Mincho"/>
+          <w:bCs/>
+          <w:lang w:eastAsia="ja-JP"/>
+        </w:rPr>
+        <w:t>(</w:t>
+      </w:r>
+      <w:proofErr w:type="spellStart"/>
+      <w:r>
+        <w:rPr>
+          <w:rFonts w:eastAsia="MS Mincho"/>
+          <w:bCs/>
+          <w:lang w:eastAsia="ja-JP"/>
+        </w:rPr>
+        <w:t>barack</w:t>
+      </w:r>
+      <w:proofErr w:type="spellEnd"/>
+      <w:r>
+        <w:rPr>
+          <w:rFonts w:eastAsia="MS Mincho"/>
+          <w:bCs/>
+          <w:lang w:eastAsia="ja-JP"/>
+        </w:rPr>
+        <w:t xml:space="preserve">, </w:t>
+      </w:r>
+      <w:proofErr w:type="spellStart"/>
+      <w:r>
+        <w:rPr>
+          <w:rFonts w:eastAsia="MS Mincho"/>
+          <w:bCs/>
+          <w:lang w:eastAsia="ja-JP"/>
+        </w:rPr>
+        <w:t>malia</w:t>
+      </w:r>
+      <w:proofErr w:type="spellEnd"/>
+      <w:r>
+        <w:rPr>
+          <w:rFonts w:eastAsia="MS Mincho"/>
+          <w:bCs/>
+          <w:lang w:eastAsia="ja-JP"/>
+        </w:rPr>
+        <w:t>)</w:t>
+      </w:r>
+      <w:r>
+        <w:rPr>
+          <w:rFonts w:eastAsia="MS Mincho"/>
+          <w:bCs/>
+          <w:lang w:eastAsia="ja-JP"/>
+        </w:rPr>
+        <w:t xml:space="preserve">, </w:t>
+      </w:r>
+      <w:proofErr w:type="spellStart"/>
+      <w:r>
+        <w:rPr>
+          <w:rFonts w:eastAsia="MS Mincho"/>
+          <w:bCs/>
+          <w:lang w:eastAsia="ja-JP"/>
+        </w:rPr>
+        <w:t>motherOf</w:t>
+      </w:r>
+      <w:proofErr w:type="spellEnd"/>
+      <w:r>
+        <w:rPr>
+          <w:rFonts w:eastAsia="MS Mincho"/>
+          <w:bCs/>
+          <w:lang w:eastAsia="ja-JP"/>
+        </w:rPr>
+        <w:t>(</w:t>
+      </w:r>
+      <w:proofErr w:type="spellStart"/>
+      <w:r>
+        <w:rPr>
+          <w:rFonts w:eastAsia="MS Mincho"/>
+          <w:bCs/>
+          <w:lang w:eastAsia="ja-JP"/>
+        </w:rPr>
+        <w:t>michelle</w:t>
+      </w:r>
+      <w:proofErr w:type="spellEnd"/>
+      <w:r>
+        <w:rPr>
+          <w:rFonts w:eastAsia="MS Mincho"/>
+          <w:bCs/>
+          <w:lang w:eastAsia="ja-JP"/>
+        </w:rPr>
+        <w:t xml:space="preserve">, </w:t>
+      </w:r>
+      <w:proofErr w:type="spellStart"/>
+      <w:r>
+        <w:rPr>
+          <w:rFonts w:eastAsia="MS Mincho"/>
+          <w:bCs/>
+          <w:lang w:eastAsia="ja-JP"/>
+        </w:rPr>
+        <w:t>malia</w:t>
+      </w:r>
+      <w:proofErr w:type="spellEnd"/>
+      <w:r>
+        <w:rPr>
+          <w:rFonts w:eastAsia="MS Mincho"/>
+          <w:bCs/>
+          <w:lang w:eastAsia="ja-JP"/>
+        </w:rPr>
+        <w:t>)</w:t>
+      </w:r>
+      <w:r>
+        <w:rPr>
+          <w:rFonts w:eastAsia="MS Mincho"/>
+          <w:bCs/>
+          <w:lang w:eastAsia="ja-JP"/>
+        </w:rPr>
+        <w:t>,</w:t>
+      </w:r>
+      <w:r>
+        <w:rPr>
+          <w:rFonts w:eastAsia="MS Mincho"/>
+          <w:bCs/>
+          <w:lang w:eastAsia="ja-JP"/>
+        </w:rPr>
+        <w:t xml:space="preserve"> </w:t>
+      </w:r>
+      <w:proofErr w:type="spellStart"/>
+      <w:r>
+        <w:rPr>
+          <w:rFonts w:eastAsia="MS Mincho"/>
+          <w:bCs/>
+          <w:lang w:eastAsia="ja-JP"/>
+        </w:rPr>
+        <w:t>fatherOf</w:t>
+      </w:r>
+      <w:proofErr w:type="spellEnd"/>
+      <w:r>
+        <w:rPr>
+          <w:rFonts w:eastAsia="MS Mincho"/>
+          <w:bCs/>
+          <w:lang w:eastAsia="ja-JP"/>
+        </w:rPr>
+        <w:t>(</w:t>
+      </w:r>
+      <w:proofErr w:type="spellStart"/>
+      <w:r>
+        <w:rPr>
+          <w:rFonts w:eastAsia="MS Mincho"/>
+          <w:bCs/>
+          <w:lang w:eastAsia="ja-JP"/>
+        </w:rPr>
+        <w:t>barack</w:t>
+      </w:r>
+      <w:proofErr w:type="spellEnd"/>
+      <w:r>
+        <w:rPr>
+          <w:rFonts w:eastAsia="MS Mincho"/>
+          <w:bCs/>
+          <w:lang w:eastAsia="ja-JP"/>
+        </w:rPr>
+        <w:t xml:space="preserve">, </w:t>
+      </w:r>
+      <w:proofErr w:type="spellStart"/>
+      <w:r>
+        <w:rPr>
+          <w:rFonts w:eastAsia="MS Mincho"/>
+          <w:bCs/>
+          <w:lang w:eastAsia="ja-JP"/>
+        </w:rPr>
+        <w:t>natasha</w:t>
+      </w:r>
+      <w:proofErr w:type="spellEnd"/>
+      <w:r>
+        <w:rPr>
+          <w:rFonts w:eastAsia="MS Mincho"/>
+          <w:bCs/>
+          <w:lang w:eastAsia="ja-JP"/>
+        </w:rPr>
+        <w:t>)</w:t>
+      </w:r>
+      <w:r>
+        <w:rPr>
+          <w:rFonts w:eastAsia="MS Mincho"/>
+          <w:bCs/>
+          <w:lang w:eastAsia="ja-JP"/>
+        </w:rPr>
+        <w:t>,</w:t>
+      </w:r>
+      <w:r>
+        <w:rPr>
+          <w:rFonts w:eastAsia="MS Mincho"/>
+          <w:bCs/>
+          <w:lang w:eastAsia="ja-JP"/>
+        </w:rPr>
+        <w:t xml:space="preserve"> </w:t>
+      </w:r>
+      <w:proofErr w:type="spellStart"/>
+      <w:r>
+        <w:rPr>
+          <w:rFonts w:eastAsia="MS Mincho"/>
+          <w:bCs/>
+          <w:lang w:eastAsia="ja-JP"/>
+        </w:rPr>
+        <w:t>motherOf</w:t>
+      </w:r>
+      <w:proofErr w:type="spellEnd"/>
+      <w:r>
+        <w:rPr>
+          <w:rFonts w:eastAsia="MS Mincho"/>
+          <w:bCs/>
+          <w:lang w:eastAsia="ja-JP"/>
+        </w:rPr>
+        <w:t>(</w:t>
+      </w:r>
+      <w:proofErr w:type="spellStart"/>
+      <w:r>
+        <w:rPr>
+          <w:rFonts w:eastAsia="MS Mincho"/>
+          <w:bCs/>
+          <w:lang w:eastAsia="ja-JP"/>
+        </w:rPr>
+        <w:t>michelle</w:t>
+      </w:r>
+      <w:proofErr w:type="spellEnd"/>
+      <w:r>
+        <w:rPr>
+          <w:rFonts w:eastAsia="MS Mincho"/>
+          <w:bCs/>
+          <w:lang w:eastAsia="ja-JP"/>
+        </w:rPr>
+        <w:t xml:space="preserve">, </w:t>
+      </w:r>
+      <w:proofErr w:type="spellStart"/>
+      <w:r>
+        <w:rPr>
+          <w:rFonts w:eastAsia="MS Mincho"/>
+          <w:bCs/>
+          <w:lang w:eastAsia="ja-JP"/>
+        </w:rPr>
+        <w:t>natasha</w:t>
+      </w:r>
+      <w:proofErr w:type="spellEnd"/>
+      <w:r>
+        <w:rPr>
+          <w:rFonts w:eastAsia="MS Mincho"/>
+          <w:bCs/>
+          <w:lang w:eastAsia="ja-JP"/>
+        </w:rPr>
+        <w:t>)</w:t>
+      </w:r>
+      <w:r>
+        <w:rPr>
+          <w:rFonts w:eastAsia="MS Mincho"/>
+          <w:bCs/>
+          <w:lang w:eastAsia="ja-JP"/>
+        </w:rPr>
+        <w:t>,</w:t>
+      </w:r>
+      <w:r>
+        <w:rPr>
+          <w:rFonts w:eastAsia="MS Mincho"/>
+          <w:bCs/>
+          <w:lang w:eastAsia="ja-JP"/>
+        </w:rPr>
+        <w:t xml:space="preserve"> male(craig)</w:t>
+      </w:r>
+      <w:r>
+        <w:rPr>
+          <w:rFonts w:eastAsia="MS Mincho"/>
+          <w:bCs/>
+          <w:lang w:eastAsia="ja-JP"/>
+        </w:rPr>
+        <w:t>,</w:t>
+      </w:r>
+      <w:r>
+        <w:rPr>
+          <w:rFonts w:eastAsia="MS Mincho"/>
+          <w:bCs/>
+          <w:lang w:eastAsia="ja-JP"/>
+        </w:rPr>
+        <w:t xml:space="preserve"> female(</w:t>
+      </w:r>
+      <w:proofErr w:type="spellStart"/>
+      <w:r>
+        <w:rPr>
+          <w:rFonts w:eastAsia="MS Mincho"/>
+          <w:bCs/>
+          <w:lang w:eastAsia="ja-JP"/>
+        </w:rPr>
+        <w:t>natasha</w:t>
+      </w:r>
+      <w:proofErr w:type="spellEnd"/>
+      <w:r>
+        <w:rPr>
+          <w:rFonts w:eastAsia="MS Mincho"/>
+          <w:bCs/>
+          <w:lang w:eastAsia="ja-JP"/>
+        </w:rPr>
+        <w:t>)</w:t>
+      </w:r>
+      <w:r>
+        <w:rPr>
+          <w:rFonts w:eastAsia="MS Mincho"/>
+          <w:bCs/>
+          <w:lang w:eastAsia="ja-JP"/>
+        </w:rPr>
+        <w:t>}</w:t>
       </w:r>
     </w:p>
     <w:p>
@@ -1072,15 +2124,825 @@
           <w:bCs/>
           <w:lang w:eastAsia="ja-JP"/>
         </w:rPr>
-        <w:t xml:space="preserve">T P ↑ 0 = </w:t>
-      </w:r>
-      <w:r>
-        <w:rPr>
-          <w:rFonts w:ascii="Cambria Math" w:eastAsia="MS Mincho" w:hAnsi="Cambria Math" w:cs="Cambria Math"/>
-          <w:bCs/>
-          <w:lang w:eastAsia="ja-JP"/>
-        </w:rPr>
-        <w:t>∅</w:t>
+        <w:t xml:space="preserve">T P ↑ </w:t>
+      </w:r>
+      <w:r>
+        <w:rPr>
+          <w:rFonts w:eastAsia="MS Mincho"/>
+          <w:bCs/>
+          <w:lang w:eastAsia="ja-JP"/>
+        </w:rPr>
+        <w:t>2</w:t>
+      </w:r>
+      <w:r>
+        <w:rPr>
+          <w:rFonts w:eastAsia="MS Mincho"/>
+          <w:bCs/>
+          <w:lang w:eastAsia="ja-JP"/>
+        </w:rPr>
+        <w:t xml:space="preserve"> =</w:t>
+      </w:r>
+      <w:r>
+        <w:rPr>
+          <w:rFonts w:eastAsia="MS Mincho"/>
+          <w:bCs/>
+          <w:lang w:eastAsia="ja-JP"/>
+        </w:rPr>
+        <w:t xml:space="preserve"> {</w:t>
+      </w:r>
+      <w:proofErr w:type="spellStart"/>
+      <w:r>
+        <w:rPr>
+          <w:rFonts w:eastAsia="MS Mincho"/>
+          <w:bCs/>
+          <w:lang w:eastAsia="ja-JP"/>
+        </w:rPr>
+        <w:t>motherOf</w:t>
+      </w:r>
+      <w:proofErr w:type="spellEnd"/>
+      <w:r>
+        <w:rPr>
+          <w:rFonts w:eastAsia="MS Mincho"/>
+          <w:bCs/>
+          <w:lang w:eastAsia="ja-JP"/>
+        </w:rPr>
+        <w:t>(</w:t>
+      </w:r>
+      <w:proofErr w:type="spellStart"/>
+      <w:r>
+        <w:rPr>
+          <w:rFonts w:eastAsia="MS Mincho"/>
+          <w:bCs/>
+          <w:lang w:eastAsia="ja-JP"/>
+        </w:rPr>
+        <w:t>marian</w:t>
+      </w:r>
+      <w:proofErr w:type="spellEnd"/>
+      <w:r>
+        <w:rPr>
+          <w:rFonts w:eastAsia="MS Mincho"/>
+          <w:bCs/>
+          <w:lang w:eastAsia="ja-JP"/>
+        </w:rPr>
+        <w:t xml:space="preserve">, </w:t>
+      </w:r>
+      <w:proofErr w:type="spellStart"/>
+      <w:r>
+        <w:rPr>
+          <w:rFonts w:eastAsia="MS Mincho"/>
+          <w:bCs/>
+          <w:lang w:eastAsia="ja-JP"/>
+        </w:rPr>
+        <w:t>michelle</w:t>
+      </w:r>
+      <w:proofErr w:type="spellEnd"/>
+      <w:r>
+        <w:rPr>
+          <w:rFonts w:eastAsia="MS Mincho"/>
+          <w:bCs/>
+          <w:lang w:eastAsia="ja-JP"/>
+        </w:rPr>
+        <w:t>)</w:t>
+      </w:r>
+      <w:r>
+        <w:rPr>
+          <w:rFonts w:eastAsia="MS Mincho"/>
+          <w:bCs/>
+          <w:lang w:eastAsia="ja-JP"/>
+        </w:rPr>
+        <w:t>,</w:t>
+      </w:r>
+      <w:r>
+        <w:rPr>
+          <w:rFonts w:eastAsia="MS Mincho"/>
+          <w:bCs/>
+          <w:lang w:eastAsia="ja-JP"/>
+        </w:rPr>
+        <w:t xml:space="preserve"> </w:t>
+      </w:r>
+      <w:proofErr w:type="spellStart"/>
+      <w:r>
+        <w:rPr>
+          <w:rFonts w:eastAsia="MS Mincho"/>
+          <w:bCs/>
+          <w:lang w:eastAsia="ja-JP"/>
+        </w:rPr>
+        <w:t>brotherOf</w:t>
+      </w:r>
+      <w:proofErr w:type="spellEnd"/>
+      <w:r>
+        <w:rPr>
+          <w:rFonts w:eastAsia="MS Mincho"/>
+          <w:bCs/>
+          <w:lang w:eastAsia="ja-JP"/>
+        </w:rPr>
+        <w:t xml:space="preserve">(craig, </w:t>
+      </w:r>
+      <w:proofErr w:type="spellStart"/>
+      <w:r>
+        <w:rPr>
+          <w:rFonts w:eastAsia="MS Mincho"/>
+          <w:bCs/>
+          <w:lang w:eastAsia="ja-JP"/>
+        </w:rPr>
+        <w:t>michelle</w:t>
+      </w:r>
+      <w:proofErr w:type="spellEnd"/>
+      <w:r>
+        <w:rPr>
+          <w:rFonts w:eastAsia="MS Mincho"/>
+          <w:bCs/>
+          <w:lang w:eastAsia="ja-JP"/>
+        </w:rPr>
+        <w:t>)</w:t>
+      </w:r>
+      <w:r>
+        <w:rPr>
+          <w:rFonts w:eastAsia="MS Mincho"/>
+          <w:bCs/>
+          <w:lang w:eastAsia="ja-JP"/>
+        </w:rPr>
+        <w:t>,</w:t>
+      </w:r>
+      <w:r>
+        <w:rPr>
+          <w:rFonts w:eastAsia="MS Mincho"/>
+          <w:bCs/>
+          <w:lang w:eastAsia="ja-JP"/>
+        </w:rPr>
+        <w:t xml:space="preserve"> </w:t>
+      </w:r>
+      <w:proofErr w:type="spellStart"/>
+      <w:r>
+        <w:rPr>
+          <w:rFonts w:eastAsia="MS Mincho"/>
+          <w:bCs/>
+          <w:lang w:eastAsia="ja-JP"/>
+        </w:rPr>
+        <w:t>motherOf</w:t>
+      </w:r>
+      <w:proofErr w:type="spellEnd"/>
+      <w:r>
+        <w:rPr>
+          <w:rFonts w:eastAsia="MS Mincho"/>
+          <w:bCs/>
+          <w:lang w:eastAsia="ja-JP"/>
+        </w:rPr>
+        <w:t>(</w:t>
+      </w:r>
+      <w:proofErr w:type="spellStart"/>
+      <w:r>
+        <w:rPr>
+          <w:rFonts w:eastAsia="MS Mincho"/>
+          <w:bCs/>
+          <w:lang w:eastAsia="ja-JP"/>
+        </w:rPr>
+        <w:t>ann</w:t>
+      </w:r>
+      <w:proofErr w:type="spellEnd"/>
+      <w:r>
+        <w:rPr>
+          <w:rFonts w:eastAsia="MS Mincho"/>
+          <w:bCs/>
+          <w:lang w:eastAsia="ja-JP"/>
+        </w:rPr>
+        <w:t xml:space="preserve">, </w:t>
+      </w:r>
+      <w:proofErr w:type="spellStart"/>
+      <w:r>
+        <w:rPr>
+          <w:rFonts w:eastAsia="MS Mincho"/>
+          <w:bCs/>
+          <w:lang w:eastAsia="ja-JP"/>
+        </w:rPr>
+        <w:t>barack</w:t>
+      </w:r>
+      <w:proofErr w:type="spellEnd"/>
+      <w:r>
+        <w:rPr>
+          <w:rFonts w:eastAsia="MS Mincho"/>
+          <w:bCs/>
+          <w:lang w:eastAsia="ja-JP"/>
+        </w:rPr>
+        <w:t>)</w:t>
+      </w:r>
+      <w:r>
+        <w:rPr>
+          <w:rFonts w:eastAsia="MS Mincho"/>
+          <w:bCs/>
+          <w:lang w:eastAsia="ja-JP"/>
+        </w:rPr>
+        <w:t xml:space="preserve">, </w:t>
+      </w:r>
+      <w:proofErr w:type="spellStart"/>
+      <w:r>
+        <w:rPr>
+          <w:rFonts w:eastAsia="MS Mincho"/>
+          <w:bCs/>
+          <w:lang w:eastAsia="ja-JP"/>
+        </w:rPr>
+        <w:t>fatherOf</w:t>
+      </w:r>
+      <w:proofErr w:type="spellEnd"/>
+      <w:r>
+        <w:rPr>
+          <w:rFonts w:eastAsia="MS Mincho"/>
+          <w:bCs/>
+          <w:lang w:eastAsia="ja-JP"/>
+        </w:rPr>
+        <w:t>(</w:t>
+      </w:r>
+      <w:proofErr w:type="spellStart"/>
+      <w:r>
+        <w:rPr>
+          <w:rFonts w:eastAsia="MS Mincho"/>
+          <w:bCs/>
+          <w:lang w:eastAsia="ja-JP"/>
+        </w:rPr>
+        <w:t>barack</w:t>
+      </w:r>
+      <w:proofErr w:type="spellEnd"/>
+      <w:r>
+        <w:rPr>
+          <w:rFonts w:eastAsia="MS Mincho"/>
+          <w:bCs/>
+          <w:lang w:eastAsia="ja-JP"/>
+        </w:rPr>
+        <w:t xml:space="preserve">, </w:t>
+      </w:r>
+      <w:proofErr w:type="spellStart"/>
+      <w:r>
+        <w:rPr>
+          <w:rFonts w:eastAsia="MS Mincho"/>
+          <w:bCs/>
+          <w:lang w:eastAsia="ja-JP"/>
+        </w:rPr>
+        <w:t>malia</w:t>
+      </w:r>
+      <w:proofErr w:type="spellEnd"/>
+      <w:r>
+        <w:rPr>
+          <w:rFonts w:eastAsia="MS Mincho"/>
+          <w:bCs/>
+          <w:lang w:eastAsia="ja-JP"/>
+        </w:rPr>
+        <w:t>)</w:t>
+      </w:r>
+      <w:r>
+        <w:rPr>
+          <w:rFonts w:eastAsia="MS Mincho"/>
+          <w:bCs/>
+          <w:lang w:eastAsia="ja-JP"/>
+        </w:rPr>
+        <w:t xml:space="preserve">, </w:t>
+      </w:r>
+      <w:proofErr w:type="spellStart"/>
+      <w:r>
+        <w:rPr>
+          <w:rFonts w:eastAsia="MS Mincho"/>
+          <w:bCs/>
+          <w:lang w:eastAsia="ja-JP"/>
+        </w:rPr>
+        <w:t>motherOf</w:t>
+      </w:r>
+      <w:proofErr w:type="spellEnd"/>
+      <w:r>
+        <w:rPr>
+          <w:rFonts w:eastAsia="MS Mincho"/>
+          <w:bCs/>
+          <w:lang w:eastAsia="ja-JP"/>
+        </w:rPr>
+        <w:t>(</w:t>
+      </w:r>
+      <w:proofErr w:type="spellStart"/>
+      <w:r>
+        <w:rPr>
+          <w:rFonts w:eastAsia="MS Mincho"/>
+          <w:bCs/>
+          <w:lang w:eastAsia="ja-JP"/>
+        </w:rPr>
+        <w:t>michelle</w:t>
+      </w:r>
+      <w:proofErr w:type="spellEnd"/>
+      <w:r>
+        <w:rPr>
+          <w:rFonts w:eastAsia="MS Mincho"/>
+          <w:bCs/>
+          <w:lang w:eastAsia="ja-JP"/>
+        </w:rPr>
+        <w:t xml:space="preserve">, </w:t>
+      </w:r>
+      <w:proofErr w:type="spellStart"/>
+      <w:r>
+        <w:rPr>
+          <w:rFonts w:eastAsia="MS Mincho"/>
+          <w:bCs/>
+          <w:lang w:eastAsia="ja-JP"/>
+        </w:rPr>
+        <w:t>malia</w:t>
+      </w:r>
+      <w:proofErr w:type="spellEnd"/>
+      <w:r>
+        <w:rPr>
+          <w:rFonts w:eastAsia="MS Mincho"/>
+          <w:bCs/>
+          <w:lang w:eastAsia="ja-JP"/>
+        </w:rPr>
+        <w:t>)</w:t>
+      </w:r>
+      <w:r>
+        <w:rPr>
+          <w:rFonts w:eastAsia="MS Mincho"/>
+          <w:bCs/>
+          <w:lang w:eastAsia="ja-JP"/>
+        </w:rPr>
+        <w:t>,</w:t>
+      </w:r>
+      <w:r>
+        <w:rPr>
+          <w:rFonts w:eastAsia="MS Mincho"/>
+          <w:bCs/>
+          <w:lang w:eastAsia="ja-JP"/>
+        </w:rPr>
+        <w:t xml:space="preserve"> </w:t>
+      </w:r>
+      <w:proofErr w:type="spellStart"/>
+      <w:r>
+        <w:rPr>
+          <w:rFonts w:eastAsia="MS Mincho"/>
+          <w:bCs/>
+          <w:lang w:eastAsia="ja-JP"/>
+        </w:rPr>
+        <w:t>fatherOf</w:t>
+      </w:r>
+      <w:proofErr w:type="spellEnd"/>
+      <w:r>
+        <w:rPr>
+          <w:rFonts w:eastAsia="MS Mincho"/>
+          <w:bCs/>
+          <w:lang w:eastAsia="ja-JP"/>
+        </w:rPr>
+        <w:t>(</w:t>
+      </w:r>
+      <w:proofErr w:type="spellStart"/>
+      <w:r>
+        <w:rPr>
+          <w:rFonts w:eastAsia="MS Mincho"/>
+          <w:bCs/>
+          <w:lang w:eastAsia="ja-JP"/>
+        </w:rPr>
+        <w:t>barack</w:t>
+      </w:r>
+      <w:proofErr w:type="spellEnd"/>
+      <w:r>
+        <w:rPr>
+          <w:rFonts w:eastAsia="MS Mincho"/>
+          <w:bCs/>
+          <w:lang w:eastAsia="ja-JP"/>
+        </w:rPr>
+        <w:t xml:space="preserve">, </w:t>
+      </w:r>
+      <w:proofErr w:type="spellStart"/>
+      <w:r>
+        <w:rPr>
+          <w:rFonts w:eastAsia="MS Mincho"/>
+          <w:bCs/>
+          <w:lang w:eastAsia="ja-JP"/>
+        </w:rPr>
+        <w:t>natasha</w:t>
+      </w:r>
+      <w:proofErr w:type="spellEnd"/>
+      <w:r>
+        <w:rPr>
+          <w:rFonts w:eastAsia="MS Mincho"/>
+          <w:bCs/>
+          <w:lang w:eastAsia="ja-JP"/>
+        </w:rPr>
+        <w:t>)</w:t>
+      </w:r>
+      <w:r>
+        <w:rPr>
+          <w:rFonts w:eastAsia="MS Mincho"/>
+          <w:bCs/>
+          <w:lang w:eastAsia="ja-JP"/>
+        </w:rPr>
+        <w:t>,</w:t>
+      </w:r>
+      <w:r>
+        <w:rPr>
+          <w:rFonts w:eastAsia="MS Mincho"/>
+          <w:bCs/>
+          <w:lang w:eastAsia="ja-JP"/>
+        </w:rPr>
+        <w:t xml:space="preserve"> </w:t>
+      </w:r>
+      <w:proofErr w:type="spellStart"/>
+      <w:r>
+        <w:rPr>
+          <w:rFonts w:eastAsia="MS Mincho"/>
+          <w:bCs/>
+          <w:lang w:eastAsia="ja-JP"/>
+        </w:rPr>
+        <w:t>motherOf</w:t>
+      </w:r>
+      <w:proofErr w:type="spellEnd"/>
+      <w:r>
+        <w:rPr>
+          <w:rFonts w:eastAsia="MS Mincho"/>
+          <w:bCs/>
+          <w:lang w:eastAsia="ja-JP"/>
+        </w:rPr>
+        <w:t>(</w:t>
+      </w:r>
+      <w:proofErr w:type="spellStart"/>
+      <w:r>
+        <w:rPr>
+          <w:rFonts w:eastAsia="MS Mincho"/>
+          <w:bCs/>
+          <w:lang w:eastAsia="ja-JP"/>
+        </w:rPr>
+        <w:t>michelle</w:t>
+      </w:r>
+      <w:proofErr w:type="spellEnd"/>
+      <w:r>
+        <w:rPr>
+          <w:rFonts w:eastAsia="MS Mincho"/>
+          <w:bCs/>
+          <w:lang w:eastAsia="ja-JP"/>
+        </w:rPr>
+        <w:t xml:space="preserve">, </w:t>
+      </w:r>
+      <w:proofErr w:type="spellStart"/>
+      <w:r>
+        <w:rPr>
+          <w:rFonts w:eastAsia="MS Mincho"/>
+          <w:bCs/>
+          <w:lang w:eastAsia="ja-JP"/>
+        </w:rPr>
+        <w:t>natasha</w:t>
+      </w:r>
+      <w:proofErr w:type="spellEnd"/>
+      <w:r>
+        <w:rPr>
+          <w:rFonts w:eastAsia="MS Mincho"/>
+          <w:bCs/>
+          <w:lang w:eastAsia="ja-JP"/>
+        </w:rPr>
+        <w:t>)</w:t>
+      </w:r>
+      <w:r>
+        <w:rPr>
+          <w:rFonts w:eastAsia="MS Mincho"/>
+          <w:bCs/>
+          <w:lang w:eastAsia="ja-JP"/>
+        </w:rPr>
+        <w:t>,</w:t>
+      </w:r>
+      <w:r>
+        <w:rPr>
+          <w:rFonts w:eastAsia="MS Mincho"/>
+          <w:bCs/>
+          <w:lang w:eastAsia="ja-JP"/>
+        </w:rPr>
+        <w:t xml:space="preserve"> male(craig)</w:t>
+      </w:r>
+      <w:r>
+        <w:rPr>
+          <w:rFonts w:eastAsia="MS Mincho"/>
+          <w:bCs/>
+          <w:lang w:eastAsia="ja-JP"/>
+        </w:rPr>
+        <w:t>,</w:t>
+      </w:r>
+      <w:r>
+        <w:rPr>
+          <w:rFonts w:eastAsia="MS Mincho"/>
+          <w:bCs/>
+          <w:lang w:eastAsia="ja-JP"/>
+        </w:rPr>
+        <w:t xml:space="preserve"> female(</w:t>
+      </w:r>
+      <w:proofErr w:type="spellStart"/>
+      <w:r>
+        <w:rPr>
+          <w:rFonts w:eastAsia="MS Mincho"/>
+          <w:bCs/>
+          <w:lang w:eastAsia="ja-JP"/>
+        </w:rPr>
+        <w:t>natasha</w:t>
+      </w:r>
+      <w:proofErr w:type="spellEnd"/>
+      <w:r>
+        <w:rPr>
+          <w:rFonts w:eastAsia="MS Mincho"/>
+          <w:bCs/>
+          <w:lang w:eastAsia="ja-JP"/>
+        </w:rPr>
+        <w:t>)</w:t>
+      </w:r>
+      <w:r>
+        <w:rPr>
+          <w:rFonts w:eastAsia="MS Mincho"/>
+          <w:bCs/>
+          <w:lang w:eastAsia="ja-JP"/>
+        </w:rPr>
+        <w:t xml:space="preserve">, </w:t>
+      </w:r>
+      <w:proofErr w:type="spellStart"/>
+      <w:r>
+        <w:rPr>
+          <w:rFonts w:eastAsia="MS Mincho"/>
+          <w:bCs/>
+          <w:lang w:eastAsia="ja-JP"/>
+        </w:rPr>
+        <w:t>parentOf</w:t>
+      </w:r>
+      <w:proofErr w:type="spellEnd"/>
+      <w:r>
+        <w:rPr>
+          <w:rFonts w:eastAsia="MS Mincho"/>
+          <w:bCs/>
+          <w:lang w:eastAsia="ja-JP"/>
+        </w:rPr>
+        <w:t>(</w:t>
+      </w:r>
+      <w:proofErr w:type="spellStart"/>
+      <w:r>
+        <w:rPr>
+          <w:rFonts w:eastAsia="MS Mincho"/>
+          <w:bCs/>
+          <w:lang w:eastAsia="ja-JP"/>
+        </w:rPr>
+        <w:t>ann</w:t>
+      </w:r>
+      <w:proofErr w:type="spellEnd"/>
+      <w:r>
+        <w:rPr>
+          <w:rFonts w:eastAsia="MS Mincho"/>
+          <w:bCs/>
+          <w:lang w:eastAsia="ja-JP"/>
+        </w:rPr>
+        <w:t xml:space="preserve">, </w:t>
+      </w:r>
+      <w:proofErr w:type="spellStart"/>
+      <w:r>
+        <w:rPr>
+          <w:rFonts w:eastAsia="MS Mincho"/>
+          <w:bCs/>
+          <w:lang w:eastAsia="ja-JP"/>
+        </w:rPr>
+        <w:t>barack</w:t>
+      </w:r>
+      <w:proofErr w:type="spellEnd"/>
+      <w:r>
+        <w:rPr>
+          <w:rFonts w:eastAsia="MS Mincho"/>
+          <w:bCs/>
+          <w:lang w:eastAsia="ja-JP"/>
+        </w:rPr>
+        <w:t xml:space="preserve">), </w:t>
+      </w:r>
+      <w:proofErr w:type="spellStart"/>
+      <w:r>
+        <w:rPr>
+          <w:rFonts w:eastAsia="MS Mincho"/>
+          <w:bCs/>
+          <w:lang w:eastAsia="ja-JP"/>
+        </w:rPr>
+        <w:t>parentOf</w:t>
+      </w:r>
+      <w:proofErr w:type="spellEnd"/>
+      <w:r>
+        <w:rPr>
+          <w:rFonts w:eastAsia="MS Mincho"/>
+          <w:bCs/>
+          <w:lang w:eastAsia="ja-JP"/>
+        </w:rPr>
+        <w:t>(</w:t>
+      </w:r>
+      <w:proofErr w:type="spellStart"/>
+      <w:r>
+        <w:rPr>
+          <w:rFonts w:eastAsia="MS Mincho"/>
+          <w:bCs/>
+          <w:lang w:eastAsia="ja-JP"/>
+        </w:rPr>
+        <w:t>barack</w:t>
+      </w:r>
+      <w:proofErr w:type="spellEnd"/>
+      <w:r>
+        <w:rPr>
+          <w:rFonts w:eastAsia="MS Mincho"/>
+          <w:bCs/>
+          <w:lang w:eastAsia="ja-JP"/>
+        </w:rPr>
+        <w:t xml:space="preserve">, </w:t>
+      </w:r>
+      <w:proofErr w:type="spellStart"/>
+      <w:r>
+        <w:rPr>
+          <w:rFonts w:eastAsia="MS Mincho"/>
+          <w:bCs/>
+          <w:lang w:eastAsia="ja-JP"/>
+        </w:rPr>
+        <w:t>malia</w:t>
+      </w:r>
+      <w:proofErr w:type="spellEnd"/>
+      <w:r>
+        <w:rPr>
+          <w:rFonts w:eastAsia="MS Mincho"/>
+          <w:bCs/>
+          <w:lang w:eastAsia="ja-JP"/>
+        </w:rPr>
+        <w:t xml:space="preserve">), </w:t>
+      </w:r>
+      <w:proofErr w:type="spellStart"/>
+      <w:r>
+        <w:rPr>
+          <w:rFonts w:eastAsia="MS Mincho"/>
+          <w:bCs/>
+          <w:lang w:eastAsia="ja-JP"/>
+        </w:rPr>
+        <w:t>parentOf</w:t>
+      </w:r>
+      <w:proofErr w:type="spellEnd"/>
+      <w:r>
+        <w:rPr>
+          <w:rFonts w:eastAsia="MS Mincho"/>
+          <w:bCs/>
+          <w:lang w:eastAsia="ja-JP"/>
+        </w:rPr>
+        <w:t>(</w:t>
+      </w:r>
+      <w:proofErr w:type="spellStart"/>
+      <w:r>
+        <w:rPr>
+          <w:rFonts w:eastAsia="MS Mincho"/>
+          <w:bCs/>
+          <w:lang w:eastAsia="ja-JP"/>
+        </w:rPr>
+        <w:t>michelle</w:t>
+      </w:r>
+      <w:proofErr w:type="spellEnd"/>
+      <w:r>
+        <w:rPr>
+          <w:rFonts w:eastAsia="MS Mincho"/>
+          <w:bCs/>
+          <w:lang w:eastAsia="ja-JP"/>
+        </w:rPr>
+        <w:t xml:space="preserve">, </w:t>
+      </w:r>
+      <w:proofErr w:type="spellStart"/>
+      <w:r>
+        <w:rPr>
+          <w:rFonts w:eastAsia="MS Mincho"/>
+          <w:bCs/>
+          <w:lang w:eastAsia="ja-JP"/>
+        </w:rPr>
+        <w:t>malia</w:t>
+      </w:r>
+      <w:proofErr w:type="spellEnd"/>
+      <w:r>
+        <w:rPr>
+          <w:rFonts w:eastAsia="MS Mincho"/>
+          <w:bCs/>
+          <w:lang w:eastAsia="ja-JP"/>
+        </w:rPr>
+        <w:t xml:space="preserve">), </w:t>
+      </w:r>
+      <w:proofErr w:type="spellStart"/>
+      <w:r>
+        <w:rPr>
+          <w:rFonts w:eastAsia="MS Mincho"/>
+          <w:bCs/>
+          <w:lang w:eastAsia="ja-JP"/>
+        </w:rPr>
+        <w:t>parentOf</w:t>
+      </w:r>
+      <w:proofErr w:type="spellEnd"/>
+      <w:r>
+        <w:rPr>
+          <w:rFonts w:eastAsia="MS Mincho"/>
+          <w:bCs/>
+          <w:lang w:eastAsia="ja-JP"/>
+        </w:rPr>
+        <w:t>(</w:t>
+      </w:r>
+      <w:proofErr w:type="spellStart"/>
+      <w:r>
+        <w:rPr>
+          <w:rFonts w:eastAsia="MS Mincho"/>
+          <w:bCs/>
+          <w:lang w:eastAsia="ja-JP"/>
+        </w:rPr>
+        <w:t>barack</w:t>
+      </w:r>
+      <w:proofErr w:type="spellEnd"/>
+      <w:r>
+        <w:rPr>
+          <w:rFonts w:eastAsia="MS Mincho"/>
+          <w:bCs/>
+          <w:lang w:eastAsia="ja-JP"/>
+        </w:rPr>
+        <w:t xml:space="preserve">, </w:t>
+      </w:r>
+      <w:proofErr w:type="spellStart"/>
+      <w:r>
+        <w:rPr>
+          <w:rFonts w:eastAsia="MS Mincho"/>
+          <w:bCs/>
+          <w:lang w:eastAsia="ja-JP"/>
+        </w:rPr>
+        <w:t>natasha</w:t>
+      </w:r>
+      <w:proofErr w:type="spellEnd"/>
+      <w:r>
+        <w:rPr>
+          <w:rFonts w:eastAsia="MS Mincho"/>
+          <w:bCs/>
+          <w:lang w:eastAsia="ja-JP"/>
+        </w:rPr>
+        <w:t xml:space="preserve">), </w:t>
+      </w:r>
+      <w:proofErr w:type="spellStart"/>
+      <w:r>
+        <w:rPr>
+          <w:rFonts w:eastAsia="MS Mincho"/>
+          <w:bCs/>
+          <w:lang w:eastAsia="ja-JP"/>
+        </w:rPr>
+        <w:t>parentOf</w:t>
+      </w:r>
+      <w:proofErr w:type="spellEnd"/>
+      <w:r>
+        <w:rPr>
+          <w:rFonts w:eastAsia="MS Mincho"/>
+          <w:bCs/>
+          <w:lang w:eastAsia="ja-JP"/>
+        </w:rPr>
+        <w:t>(</w:t>
+      </w:r>
+      <w:proofErr w:type="spellStart"/>
+      <w:r>
+        <w:rPr>
+          <w:rFonts w:eastAsia="MS Mincho"/>
+          <w:bCs/>
+          <w:lang w:eastAsia="ja-JP"/>
+        </w:rPr>
+        <w:t>michelle</w:t>
+      </w:r>
+      <w:proofErr w:type="spellEnd"/>
+      <w:r>
+        <w:rPr>
+          <w:rFonts w:eastAsia="MS Mincho"/>
+          <w:bCs/>
+          <w:lang w:eastAsia="ja-JP"/>
+        </w:rPr>
+        <w:t xml:space="preserve">, </w:t>
+      </w:r>
+      <w:proofErr w:type="spellStart"/>
+      <w:r>
+        <w:rPr>
+          <w:rFonts w:eastAsia="MS Mincho"/>
+          <w:bCs/>
+          <w:lang w:eastAsia="ja-JP"/>
+        </w:rPr>
+        <w:t>natasha</w:t>
+      </w:r>
+      <w:proofErr w:type="spellEnd"/>
+      <w:r>
+        <w:rPr>
+          <w:rFonts w:eastAsia="MS Mincho"/>
+          <w:bCs/>
+          <w:lang w:eastAsia="ja-JP"/>
+        </w:rPr>
+        <w:t>), male(</w:t>
+      </w:r>
+      <w:proofErr w:type="spellStart"/>
+      <w:r>
+        <w:rPr>
+          <w:rFonts w:eastAsia="MS Mincho"/>
+          <w:bCs/>
+          <w:lang w:eastAsia="ja-JP"/>
+        </w:rPr>
+        <w:t>barack</w:t>
+      </w:r>
+      <w:proofErr w:type="spellEnd"/>
+      <w:r>
+        <w:rPr>
+          <w:rFonts w:eastAsia="MS Mincho"/>
+          <w:bCs/>
+          <w:lang w:eastAsia="ja-JP"/>
+        </w:rPr>
+        <w:t>)</w:t>
+      </w:r>
+      <w:r>
+        <w:rPr>
+          <w:rFonts w:eastAsia="MS Mincho"/>
+          <w:bCs/>
+          <w:lang w:eastAsia="ja-JP"/>
+        </w:rPr>
+        <w:t>}</w:t>
       </w:r>
     </w:p>
     <w:p>
@@ -1099,15 +2961,1047 @@
           <w:bCs/>
           <w:lang w:eastAsia="ja-JP"/>
         </w:rPr>
-        <w:t xml:space="preserve">T P ↑ 1 = {p(a, b), </w:t>
-      </w:r>
-      <w:r>
-        <w:rPr>
-          <w:rFonts w:eastAsia="MS Mincho"/>
-          <w:bCs/>
-          <w:lang w:eastAsia="ja-JP"/>
-        </w:rPr>
-        <w:t>p(b, c), p(c, a), p(d, d)</w:t>
+        <w:t xml:space="preserve">T P ↑ </w:t>
+      </w:r>
+      <w:r>
+        <w:rPr>
+          <w:rFonts w:eastAsia="MS Mincho"/>
+          <w:bCs/>
+          <w:lang w:eastAsia="ja-JP"/>
+        </w:rPr>
+        <w:t xml:space="preserve">3 </w:t>
+      </w:r>
+      <w:r>
+        <w:rPr>
+          <w:rFonts w:eastAsia="MS Mincho"/>
+          <w:bCs/>
+          <w:lang w:eastAsia="ja-JP"/>
+        </w:rPr>
+        <w:t>=</w:t>
+      </w:r>
+      <w:r>
+        <w:rPr>
+          <w:rFonts w:eastAsia="MS Mincho"/>
+          <w:bCs/>
+          <w:lang w:eastAsia="ja-JP"/>
+        </w:rPr>
+        <w:t xml:space="preserve"> {</w:t>
+      </w:r>
+      <w:proofErr w:type="spellStart"/>
+      <w:r>
+        <w:rPr>
+          <w:rFonts w:eastAsia="MS Mincho"/>
+          <w:bCs/>
+          <w:lang w:eastAsia="ja-JP"/>
+        </w:rPr>
+        <w:t>motherOf</w:t>
+      </w:r>
+      <w:proofErr w:type="spellEnd"/>
+      <w:r>
+        <w:rPr>
+          <w:rFonts w:eastAsia="MS Mincho"/>
+          <w:bCs/>
+          <w:lang w:eastAsia="ja-JP"/>
+        </w:rPr>
+        <w:t>(</w:t>
+      </w:r>
+      <w:proofErr w:type="spellStart"/>
+      <w:r>
+        <w:rPr>
+          <w:rFonts w:eastAsia="MS Mincho"/>
+          <w:bCs/>
+          <w:lang w:eastAsia="ja-JP"/>
+        </w:rPr>
+        <w:t>marian</w:t>
+      </w:r>
+      <w:proofErr w:type="spellEnd"/>
+      <w:r>
+        <w:rPr>
+          <w:rFonts w:eastAsia="MS Mincho"/>
+          <w:bCs/>
+          <w:lang w:eastAsia="ja-JP"/>
+        </w:rPr>
+        <w:t xml:space="preserve">, </w:t>
+      </w:r>
+      <w:proofErr w:type="spellStart"/>
+      <w:r>
+        <w:rPr>
+          <w:rFonts w:eastAsia="MS Mincho"/>
+          <w:bCs/>
+          <w:lang w:eastAsia="ja-JP"/>
+        </w:rPr>
+        <w:t>michelle</w:t>
+      </w:r>
+      <w:proofErr w:type="spellEnd"/>
+      <w:r>
+        <w:rPr>
+          <w:rFonts w:eastAsia="MS Mincho"/>
+          <w:bCs/>
+          <w:lang w:eastAsia="ja-JP"/>
+        </w:rPr>
+        <w:t>)</w:t>
+      </w:r>
+      <w:r>
+        <w:rPr>
+          <w:rFonts w:eastAsia="MS Mincho"/>
+          <w:bCs/>
+          <w:lang w:eastAsia="ja-JP"/>
+        </w:rPr>
+        <w:t>,</w:t>
+      </w:r>
+      <w:r>
+        <w:rPr>
+          <w:rFonts w:eastAsia="MS Mincho"/>
+          <w:bCs/>
+          <w:lang w:eastAsia="ja-JP"/>
+        </w:rPr>
+        <w:t xml:space="preserve"> </w:t>
+      </w:r>
+      <w:proofErr w:type="spellStart"/>
+      <w:r>
+        <w:rPr>
+          <w:rFonts w:eastAsia="MS Mincho"/>
+          <w:bCs/>
+          <w:lang w:eastAsia="ja-JP"/>
+        </w:rPr>
+        <w:t>brotherOf</w:t>
+      </w:r>
+      <w:proofErr w:type="spellEnd"/>
+      <w:r>
+        <w:rPr>
+          <w:rFonts w:eastAsia="MS Mincho"/>
+          <w:bCs/>
+          <w:lang w:eastAsia="ja-JP"/>
+        </w:rPr>
+        <w:t xml:space="preserve">(craig, </w:t>
+      </w:r>
+      <w:proofErr w:type="spellStart"/>
+      <w:r>
+        <w:rPr>
+          <w:rFonts w:eastAsia="MS Mincho"/>
+          <w:bCs/>
+          <w:lang w:eastAsia="ja-JP"/>
+        </w:rPr>
+        <w:t>michelle</w:t>
+      </w:r>
+      <w:proofErr w:type="spellEnd"/>
+      <w:r>
+        <w:rPr>
+          <w:rFonts w:eastAsia="MS Mincho"/>
+          <w:bCs/>
+          <w:lang w:eastAsia="ja-JP"/>
+        </w:rPr>
+        <w:t>)</w:t>
+      </w:r>
+      <w:r>
+        <w:rPr>
+          <w:rFonts w:eastAsia="MS Mincho"/>
+          <w:bCs/>
+          <w:lang w:eastAsia="ja-JP"/>
+        </w:rPr>
+        <w:t>,</w:t>
+      </w:r>
+      <w:r>
+        <w:rPr>
+          <w:rFonts w:eastAsia="MS Mincho"/>
+          <w:bCs/>
+          <w:lang w:eastAsia="ja-JP"/>
+        </w:rPr>
+        <w:t xml:space="preserve"> </w:t>
+      </w:r>
+      <w:proofErr w:type="spellStart"/>
+      <w:r>
+        <w:rPr>
+          <w:rFonts w:eastAsia="MS Mincho"/>
+          <w:bCs/>
+          <w:lang w:eastAsia="ja-JP"/>
+        </w:rPr>
+        <w:t>motherOf</w:t>
+      </w:r>
+      <w:proofErr w:type="spellEnd"/>
+      <w:r>
+        <w:rPr>
+          <w:rFonts w:eastAsia="MS Mincho"/>
+          <w:bCs/>
+          <w:lang w:eastAsia="ja-JP"/>
+        </w:rPr>
+        <w:t>(</w:t>
+      </w:r>
+      <w:proofErr w:type="spellStart"/>
+      <w:r>
+        <w:rPr>
+          <w:rFonts w:eastAsia="MS Mincho"/>
+          <w:bCs/>
+          <w:lang w:eastAsia="ja-JP"/>
+        </w:rPr>
+        <w:t>ann</w:t>
+      </w:r>
+      <w:proofErr w:type="spellEnd"/>
+      <w:r>
+        <w:rPr>
+          <w:rFonts w:eastAsia="MS Mincho"/>
+          <w:bCs/>
+          <w:lang w:eastAsia="ja-JP"/>
+        </w:rPr>
+        <w:t xml:space="preserve">, </w:t>
+      </w:r>
+      <w:proofErr w:type="spellStart"/>
+      <w:r>
+        <w:rPr>
+          <w:rFonts w:eastAsia="MS Mincho"/>
+          <w:bCs/>
+          <w:lang w:eastAsia="ja-JP"/>
+        </w:rPr>
+        <w:t>barack</w:t>
+      </w:r>
+      <w:proofErr w:type="spellEnd"/>
+      <w:r>
+        <w:rPr>
+          <w:rFonts w:eastAsia="MS Mincho"/>
+          <w:bCs/>
+          <w:lang w:eastAsia="ja-JP"/>
+        </w:rPr>
+        <w:t>)</w:t>
+      </w:r>
+      <w:r>
+        <w:rPr>
+          <w:rFonts w:eastAsia="MS Mincho"/>
+          <w:bCs/>
+          <w:lang w:eastAsia="ja-JP"/>
+        </w:rPr>
+        <w:t xml:space="preserve">, </w:t>
+      </w:r>
+      <w:proofErr w:type="spellStart"/>
+      <w:r>
+        <w:rPr>
+          <w:rFonts w:eastAsia="MS Mincho"/>
+          <w:bCs/>
+          <w:lang w:eastAsia="ja-JP"/>
+        </w:rPr>
+        <w:t>fatherOf</w:t>
+      </w:r>
+      <w:proofErr w:type="spellEnd"/>
+      <w:r>
+        <w:rPr>
+          <w:rFonts w:eastAsia="MS Mincho"/>
+          <w:bCs/>
+          <w:lang w:eastAsia="ja-JP"/>
+        </w:rPr>
+        <w:t>(</w:t>
+      </w:r>
+      <w:proofErr w:type="spellStart"/>
+      <w:r>
+        <w:rPr>
+          <w:rFonts w:eastAsia="MS Mincho"/>
+          <w:bCs/>
+          <w:lang w:eastAsia="ja-JP"/>
+        </w:rPr>
+        <w:t>barack</w:t>
+      </w:r>
+      <w:proofErr w:type="spellEnd"/>
+      <w:r>
+        <w:rPr>
+          <w:rFonts w:eastAsia="MS Mincho"/>
+          <w:bCs/>
+          <w:lang w:eastAsia="ja-JP"/>
+        </w:rPr>
+        <w:t xml:space="preserve">, </w:t>
+      </w:r>
+      <w:proofErr w:type="spellStart"/>
+      <w:r>
+        <w:rPr>
+          <w:rFonts w:eastAsia="MS Mincho"/>
+          <w:bCs/>
+          <w:lang w:eastAsia="ja-JP"/>
+        </w:rPr>
+        <w:t>malia</w:t>
+      </w:r>
+      <w:proofErr w:type="spellEnd"/>
+      <w:r>
+        <w:rPr>
+          <w:rFonts w:eastAsia="MS Mincho"/>
+          <w:bCs/>
+          <w:lang w:eastAsia="ja-JP"/>
+        </w:rPr>
+        <w:t>)</w:t>
+      </w:r>
+      <w:r>
+        <w:rPr>
+          <w:rFonts w:eastAsia="MS Mincho"/>
+          <w:bCs/>
+          <w:lang w:eastAsia="ja-JP"/>
+        </w:rPr>
+        <w:t xml:space="preserve">, </w:t>
+      </w:r>
+      <w:proofErr w:type="spellStart"/>
+      <w:r>
+        <w:rPr>
+          <w:rFonts w:eastAsia="MS Mincho"/>
+          <w:bCs/>
+          <w:lang w:eastAsia="ja-JP"/>
+        </w:rPr>
+        <w:t>motherOf</w:t>
+      </w:r>
+      <w:proofErr w:type="spellEnd"/>
+      <w:r>
+        <w:rPr>
+          <w:rFonts w:eastAsia="MS Mincho"/>
+          <w:bCs/>
+          <w:lang w:eastAsia="ja-JP"/>
+        </w:rPr>
+        <w:t>(</w:t>
+      </w:r>
+      <w:proofErr w:type="spellStart"/>
+      <w:r>
+        <w:rPr>
+          <w:rFonts w:eastAsia="MS Mincho"/>
+          <w:bCs/>
+          <w:lang w:eastAsia="ja-JP"/>
+        </w:rPr>
+        <w:t>michelle</w:t>
+      </w:r>
+      <w:proofErr w:type="spellEnd"/>
+      <w:r>
+        <w:rPr>
+          <w:rFonts w:eastAsia="MS Mincho"/>
+          <w:bCs/>
+          <w:lang w:eastAsia="ja-JP"/>
+        </w:rPr>
+        <w:t xml:space="preserve">, </w:t>
+      </w:r>
+      <w:proofErr w:type="spellStart"/>
+      <w:r>
+        <w:rPr>
+          <w:rFonts w:eastAsia="MS Mincho"/>
+          <w:bCs/>
+          <w:lang w:eastAsia="ja-JP"/>
+        </w:rPr>
+        <w:t>malia</w:t>
+      </w:r>
+      <w:proofErr w:type="spellEnd"/>
+      <w:r>
+        <w:rPr>
+          <w:rFonts w:eastAsia="MS Mincho"/>
+          <w:bCs/>
+          <w:lang w:eastAsia="ja-JP"/>
+        </w:rPr>
+        <w:t>)</w:t>
+      </w:r>
+      <w:r>
+        <w:rPr>
+          <w:rFonts w:eastAsia="MS Mincho"/>
+          <w:bCs/>
+          <w:lang w:eastAsia="ja-JP"/>
+        </w:rPr>
+        <w:t>,</w:t>
+      </w:r>
+      <w:r>
+        <w:rPr>
+          <w:rFonts w:eastAsia="MS Mincho"/>
+          <w:bCs/>
+          <w:lang w:eastAsia="ja-JP"/>
+        </w:rPr>
+        <w:t xml:space="preserve"> </w:t>
+      </w:r>
+      <w:proofErr w:type="spellStart"/>
+      <w:r>
+        <w:rPr>
+          <w:rFonts w:eastAsia="MS Mincho"/>
+          <w:bCs/>
+          <w:lang w:eastAsia="ja-JP"/>
+        </w:rPr>
+        <w:t>fatherOf</w:t>
+      </w:r>
+      <w:proofErr w:type="spellEnd"/>
+      <w:r>
+        <w:rPr>
+          <w:rFonts w:eastAsia="MS Mincho"/>
+          <w:bCs/>
+          <w:lang w:eastAsia="ja-JP"/>
+        </w:rPr>
+        <w:t>(</w:t>
+      </w:r>
+      <w:proofErr w:type="spellStart"/>
+      <w:r>
+        <w:rPr>
+          <w:rFonts w:eastAsia="MS Mincho"/>
+          <w:bCs/>
+          <w:lang w:eastAsia="ja-JP"/>
+        </w:rPr>
+        <w:t>barack</w:t>
+      </w:r>
+      <w:proofErr w:type="spellEnd"/>
+      <w:r>
+        <w:rPr>
+          <w:rFonts w:eastAsia="MS Mincho"/>
+          <w:bCs/>
+          <w:lang w:eastAsia="ja-JP"/>
+        </w:rPr>
+        <w:t xml:space="preserve">, </w:t>
+      </w:r>
+      <w:proofErr w:type="spellStart"/>
+      <w:r>
+        <w:rPr>
+          <w:rFonts w:eastAsia="MS Mincho"/>
+          <w:bCs/>
+          <w:lang w:eastAsia="ja-JP"/>
+        </w:rPr>
+        <w:t>natasha</w:t>
+      </w:r>
+      <w:proofErr w:type="spellEnd"/>
+      <w:r>
+        <w:rPr>
+          <w:rFonts w:eastAsia="MS Mincho"/>
+          <w:bCs/>
+          <w:lang w:eastAsia="ja-JP"/>
+        </w:rPr>
+        <w:t>)</w:t>
+      </w:r>
+      <w:r>
+        <w:rPr>
+          <w:rFonts w:eastAsia="MS Mincho"/>
+          <w:bCs/>
+          <w:lang w:eastAsia="ja-JP"/>
+        </w:rPr>
+        <w:t>,</w:t>
+      </w:r>
+      <w:r>
+        <w:rPr>
+          <w:rFonts w:eastAsia="MS Mincho"/>
+          <w:bCs/>
+          <w:lang w:eastAsia="ja-JP"/>
+        </w:rPr>
+        <w:t xml:space="preserve"> </w:t>
+      </w:r>
+      <w:proofErr w:type="spellStart"/>
+      <w:r>
+        <w:rPr>
+          <w:rFonts w:eastAsia="MS Mincho"/>
+          <w:bCs/>
+          <w:lang w:eastAsia="ja-JP"/>
+        </w:rPr>
+        <w:t>motherOf</w:t>
+      </w:r>
+      <w:proofErr w:type="spellEnd"/>
+      <w:r>
+        <w:rPr>
+          <w:rFonts w:eastAsia="MS Mincho"/>
+          <w:bCs/>
+          <w:lang w:eastAsia="ja-JP"/>
+        </w:rPr>
+        <w:t>(</w:t>
+      </w:r>
+      <w:proofErr w:type="spellStart"/>
+      <w:r>
+        <w:rPr>
+          <w:rFonts w:eastAsia="MS Mincho"/>
+          <w:bCs/>
+          <w:lang w:eastAsia="ja-JP"/>
+        </w:rPr>
+        <w:t>michelle</w:t>
+      </w:r>
+      <w:proofErr w:type="spellEnd"/>
+      <w:r>
+        <w:rPr>
+          <w:rFonts w:eastAsia="MS Mincho"/>
+          <w:bCs/>
+          <w:lang w:eastAsia="ja-JP"/>
+        </w:rPr>
+        <w:t xml:space="preserve">, </w:t>
+      </w:r>
+      <w:proofErr w:type="spellStart"/>
+      <w:r>
+        <w:rPr>
+          <w:rFonts w:eastAsia="MS Mincho"/>
+          <w:bCs/>
+          <w:lang w:eastAsia="ja-JP"/>
+        </w:rPr>
+        <w:t>natasha</w:t>
+      </w:r>
+      <w:proofErr w:type="spellEnd"/>
+      <w:r>
+        <w:rPr>
+          <w:rFonts w:eastAsia="MS Mincho"/>
+          <w:bCs/>
+          <w:lang w:eastAsia="ja-JP"/>
+        </w:rPr>
+        <w:t>)</w:t>
+      </w:r>
+      <w:r>
+        <w:rPr>
+          <w:rFonts w:eastAsia="MS Mincho"/>
+          <w:bCs/>
+          <w:lang w:eastAsia="ja-JP"/>
+        </w:rPr>
+        <w:t>,</w:t>
+      </w:r>
+      <w:r>
+        <w:rPr>
+          <w:rFonts w:eastAsia="MS Mincho"/>
+          <w:bCs/>
+          <w:lang w:eastAsia="ja-JP"/>
+        </w:rPr>
+        <w:t xml:space="preserve"> male(craig)</w:t>
+      </w:r>
+      <w:r>
+        <w:rPr>
+          <w:rFonts w:eastAsia="MS Mincho"/>
+          <w:bCs/>
+          <w:lang w:eastAsia="ja-JP"/>
+        </w:rPr>
+        <w:t>,</w:t>
+      </w:r>
+      <w:r>
+        <w:rPr>
+          <w:rFonts w:eastAsia="MS Mincho"/>
+          <w:bCs/>
+          <w:lang w:eastAsia="ja-JP"/>
+        </w:rPr>
+        <w:t xml:space="preserve"> female(</w:t>
+      </w:r>
+      <w:proofErr w:type="spellStart"/>
+      <w:r>
+        <w:rPr>
+          <w:rFonts w:eastAsia="MS Mincho"/>
+          <w:bCs/>
+          <w:lang w:eastAsia="ja-JP"/>
+        </w:rPr>
+        <w:t>natasha</w:t>
+      </w:r>
+      <w:proofErr w:type="spellEnd"/>
+      <w:r>
+        <w:rPr>
+          <w:rFonts w:eastAsia="MS Mincho"/>
+          <w:bCs/>
+          <w:lang w:eastAsia="ja-JP"/>
+        </w:rPr>
+        <w:t>)</w:t>
+      </w:r>
+      <w:r>
+        <w:rPr>
+          <w:rFonts w:eastAsia="MS Mincho"/>
+          <w:bCs/>
+          <w:lang w:eastAsia="ja-JP"/>
+        </w:rPr>
+        <w:t>,</w:t>
+      </w:r>
+      <w:r>
+        <w:rPr>
+          <w:rFonts w:eastAsia="MS Mincho"/>
+          <w:bCs/>
+          <w:lang w:eastAsia="ja-JP"/>
+        </w:rPr>
+        <w:t xml:space="preserve"> </w:t>
+      </w:r>
+      <w:proofErr w:type="spellStart"/>
+      <w:r>
+        <w:rPr>
+          <w:rFonts w:eastAsia="MS Mincho"/>
+          <w:bCs/>
+          <w:lang w:eastAsia="ja-JP"/>
+        </w:rPr>
+        <w:t>parentOf</w:t>
+      </w:r>
+      <w:proofErr w:type="spellEnd"/>
+      <w:r>
+        <w:rPr>
+          <w:rFonts w:eastAsia="MS Mincho"/>
+          <w:bCs/>
+          <w:lang w:eastAsia="ja-JP"/>
+        </w:rPr>
+        <w:t>(</w:t>
+      </w:r>
+      <w:proofErr w:type="spellStart"/>
+      <w:r>
+        <w:rPr>
+          <w:rFonts w:eastAsia="MS Mincho"/>
+          <w:bCs/>
+          <w:lang w:eastAsia="ja-JP"/>
+        </w:rPr>
+        <w:t>marian</w:t>
+      </w:r>
+      <w:proofErr w:type="spellEnd"/>
+      <w:r>
+        <w:rPr>
+          <w:rFonts w:eastAsia="MS Mincho"/>
+          <w:bCs/>
+          <w:lang w:eastAsia="ja-JP"/>
+        </w:rPr>
+        <w:t xml:space="preserve">, </w:t>
+      </w:r>
+      <w:proofErr w:type="spellStart"/>
+      <w:r>
+        <w:rPr>
+          <w:rFonts w:eastAsia="MS Mincho"/>
+          <w:bCs/>
+          <w:lang w:eastAsia="ja-JP"/>
+        </w:rPr>
+        <w:t>michelle</w:t>
+      </w:r>
+      <w:proofErr w:type="spellEnd"/>
+      <w:r>
+        <w:rPr>
+          <w:rFonts w:eastAsia="MS Mincho"/>
+          <w:bCs/>
+          <w:lang w:eastAsia="ja-JP"/>
+        </w:rPr>
+        <w:t>),</w:t>
+      </w:r>
+      <w:r>
+        <w:rPr>
+          <w:rFonts w:eastAsia="MS Mincho"/>
+          <w:bCs/>
+          <w:lang w:eastAsia="ja-JP"/>
+        </w:rPr>
+        <w:t xml:space="preserve"> parentOf(ann, </w:t>
+      </w:r>
+      <w:proofErr w:type="spellStart"/>
+      <w:r>
+        <w:rPr>
+          <w:rFonts w:eastAsia="MS Mincho"/>
+          <w:bCs/>
+          <w:lang w:eastAsia="ja-JP"/>
+        </w:rPr>
+        <w:t>barack</w:t>
+      </w:r>
+      <w:proofErr w:type="spellEnd"/>
+      <w:r>
+        <w:rPr>
+          <w:rFonts w:eastAsia="MS Mincho"/>
+          <w:bCs/>
+          <w:lang w:eastAsia="ja-JP"/>
+        </w:rPr>
+        <w:t xml:space="preserve">), </w:t>
+      </w:r>
+      <w:proofErr w:type="spellStart"/>
+      <w:r>
+        <w:rPr>
+          <w:rFonts w:eastAsia="MS Mincho"/>
+          <w:bCs/>
+          <w:lang w:eastAsia="ja-JP"/>
+        </w:rPr>
+        <w:t>parentOf</w:t>
+      </w:r>
+      <w:proofErr w:type="spellEnd"/>
+      <w:r>
+        <w:rPr>
+          <w:rFonts w:eastAsia="MS Mincho"/>
+          <w:bCs/>
+          <w:lang w:eastAsia="ja-JP"/>
+        </w:rPr>
+        <w:t>(</w:t>
+      </w:r>
+      <w:proofErr w:type="spellStart"/>
+      <w:r>
+        <w:rPr>
+          <w:rFonts w:eastAsia="MS Mincho"/>
+          <w:bCs/>
+          <w:lang w:eastAsia="ja-JP"/>
+        </w:rPr>
+        <w:t>barack</w:t>
+      </w:r>
+      <w:proofErr w:type="spellEnd"/>
+      <w:r>
+        <w:rPr>
+          <w:rFonts w:eastAsia="MS Mincho"/>
+          <w:bCs/>
+          <w:lang w:eastAsia="ja-JP"/>
+        </w:rPr>
+        <w:t xml:space="preserve">, </w:t>
+      </w:r>
+      <w:proofErr w:type="spellStart"/>
+      <w:r>
+        <w:rPr>
+          <w:rFonts w:eastAsia="MS Mincho"/>
+          <w:bCs/>
+          <w:lang w:eastAsia="ja-JP"/>
+        </w:rPr>
+        <w:t>malia</w:t>
+      </w:r>
+      <w:proofErr w:type="spellEnd"/>
+      <w:r>
+        <w:rPr>
+          <w:rFonts w:eastAsia="MS Mincho"/>
+          <w:bCs/>
+          <w:lang w:eastAsia="ja-JP"/>
+        </w:rPr>
+        <w:t xml:space="preserve">), </w:t>
+      </w:r>
+      <w:proofErr w:type="spellStart"/>
+      <w:r>
+        <w:rPr>
+          <w:rFonts w:eastAsia="MS Mincho"/>
+          <w:bCs/>
+          <w:lang w:eastAsia="ja-JP"/>
+        </w:rPr>
+        <w:t>parentOf</w:t>
+      </w:r>
+      <w:proofErr w:type="spellEnd"/>
+      <w:r>
+        <w:rPr>
+          <w:rFonts w:eastAsia="MS Mincho"/>
+          <w:bCs/>
+          <w:lang w:eastAsia="ja-JP"/>
+        </w:rPr>
+        <w:t>(</w:t>
+      </w:r>
+      <w:proofErr w:type="spellStart"/>
+      <w:r>
+        <w:rPr>
+          <w:rFonts w:eastAsia="MS Mincho"/>
+          <w:bCs/>
+          <w:lang w:eastAsia="ja-JP"/>
+        </w:rPr>
+        <w:t>michelle</w:t>
+      </w:r>
+      <w:proofErr w:type="spellEnd"/>
+      <w:r>
+        <w:rPr>
+          <w:rFonts w:eastAsia="MS Mincho"/>
+          <w:bCs/>
+          <w:lang w:eastAsia="ja-JP"/>
+        </w:rPr>
+        <w:t xml:space="preserve">, </w:t>
+      </w:r>
+      <w:proofErr w:type="spellStart"/>
+      <w:r>
+        <w:rPr>
+          <w:rFonts w:eastAsia="MS Mincho"/>
+          <w:bCs/>
+          <w:lang w:eastAsia="ja-JP"/>
+        </w:rPr>
+        <w:t>malia</w:t>
+      </w:r>
+      <w:proofErr w:type="spellEnd"/>
+      <w:r>
+        <w:rPr>
+          <w:rFonts w:eastAsia="MS Mincho"/>
+          <w:bCs/>
+          <w:lang w:eastAsia="ja-JP"/>
+        </w:rPr>
+        <w:t xml:space="preserve">), </w:t>
+      </w:r>
+      <w:proofErr w:type="spellStart"/>
+      <w:r>
+        <w:rPr>
+          <w:rFonts w:eastAsia="MS Mincho"/>
+          <w:bCs/>
+          <w:lang w:eastAsia="ja-JP"/>
+        </w:rPr>
+        <w:t>parentOf</w:t>
+      </w:r>
+      <w:proofErr w:type="spellEnd"/>
+      <w:r>
+        <w:rPr>
+          <w:rFonts w:eastAsia="MS Mincho"/>
+          <w:bCs/>
+          <w:lang w:eastAsia="ja-JP"/>
+        </w:rPr>
+        <w:t>(</w:t>
+      </w:r>
+      <w:proofErr w:type="spellStart"/>
+      <w:r>
+        <w:rPr>
+          <w:rFonts w:eastAsia="MS Mincho"/>
+          <w:bCs/>
+          <w:lang w:eastAsia="ja-JP"/>
+        </w:rPr>
+        <w:t>barack</w:t>
+      </w:r>
+      <w:proofErr w:type="spellEnd"/>
+      <w:r>
+        <w:rPr>
+          <w:rFonts w:eastAsia="MS Mincho"/>
+          <w:bCs/>
+          <w:lang w:eastAsia="ja-JP"/>
+        </w:rPr>
+        <w:t xml:space="preserve">, </w:t>
+      </w:r>
+      <w:proofErr w:type="spellStart"/>
+      <w:r>
+        <w:rPr>
+          <w:rFonts w:eastAsia="MS Mincho"/>
+          <w:bCs/>
+          <w:lang w:eastAsia="ja-JP"/>
+        </w:rPr>
+        <w:t>natasha</w:t>
+      </w:r>
+      <w:proofErr w:type="spellEnd"/>
+      <w:r>
+        <w:rPr>
+          <w:rFonts w:eastAsia="MS Mincho"/>
+          <w:bCs/>
+          <w:lang w:eastAsia="ja-JP"/>
+        </w:rPr>
+        <w:t xml:space="preserve">), </w:t>
+      </w:r>
+      <w:proofErr w:type="spellStart"/>
+      <w:r>
+        <w:rPr>
+          <w:rFonts w:eastAsia="MS Mincho"/>
+          <w:bCs/>
+          <w:lang w:eastAsia="ja-JP"/>
+        </w:rPr>
+        <w:t>parentOf</w:t>
+      </w:r>
+      <w:proofErr w:type="spellEnd"/>
+      <w:r>
+        <w:rPr>
+          <w:rFonts w:eastAsia="MS Mincho"/>
+          <w:bCs/>
+          <w:lang w:eastAsia="ja-JP"/>
+        </w:rPr>
+        <w:t>(</w:t>
+      </w:r>
+      <w:proofErr w:type="spellStart"/>
+      <w:r>
+        <w:rPr>
+          <w:rFonts w:eastAsia="MS Mincho"/>
+          <w:bCs/>
+          <w:lang w:eastAsia="ja-JP"/>
+        </w:rPr>
+        <w:t>michelle</w:t>
+      </w:r>
+      <w:proofErr w:type="spellEnd"/>
+      <w:r>
+        <w:rPr>
+          <w:rFonts w:eastAsia="MS Mincho"/>
+          <w:bCs/>
+          <w:lang w:eastAsia="ja-JP"/>
+        </w:rPr>
+        <w:t xml:space="preserve">, </w:t>
+      </w:r>
+      <w:proofErr w:type="spellStart"/>
+      <w:r>
+        <w:rPr>
+          <w:rFonts w:eastAsia="MS Mincho"/>
+          <w:bCs/>
+          <w:lang w:eastAsia="ja-JP"/>
+        </w:rPr>
+        <w:t>natasha</w:t>
+      </w:r>
+      <w:proofErr w:type="spellEnd"/>
+      <w:r>
+        <w:rPr>
+          <w:rFonts w:eastAsia="MS Mincho"/>
+          <w:bCs/>
+          <w:lang w:eastAsia="ja-JP"/>
+        </w:rPr>
+        <w:t>), male(</w:t>
+      </w:r>
+      <w:proofErr w:type="spellStart"/>
+      <w:r>
+        <w:rPr>
+          <w:rFonts w:eastAsia="MS Mincho"/>
+          <w:bCs/>
+          <w:lang w:eastAsia="ja-JP"/>
+        </w:rPr>
+        <w:t>barack</w:t>
+      </w:r>
+      <w:proofErr w:type="spellEnd"/>
+      <w:r>
+        <w:rPr>
+          <w:rFonts w:eastAsia="MS Mincho"/>
+          <w:bCs/>
+          <w:lang w:eastAsia="ja-JP"/>
+        </w:rPr>
+        <w:t>)</w:t>
+      </w:r>
+      <w:r>
+        <w:rPr>
+          <w:rFonts w:eastAsia="MS Mincho"/>
+          <w:bCs/>
+          <w:lang w:eastAsia="ja-JP"/>
+        </w:rPr>
+        <w:t xml:space="preserve">, </w:t>
+      </w:r>
+      <w:proofErr w:type="spellStart"/>
+      <w:r>
+        <w:rPr>
+          <w:rFonts w:eastAsia="MS Mincho"/>
+          <w:bCs/>
+          <w:lang w:eastAsia="ja-JP"/>
+        </w:rPr>
+        <w:t>grandmotherOf</w:t>
+      </w:r>
+      <w:proofErr w:type="spellEnd"/>
+      <w:r>
+        <w:rPr>
+          <w:rFonts w:eastAsia="MS Mincho"/>
+          <w:bCs/>
+          <w:lang w:eastAsia="ja-JP"/>
+        </w:rPr>
+        <w:t>(</w:t>
+      </w:r>
+      <w:proofErr w:type="spellStart"/>
+      <w:r>
+        <w:rPr>
+          <w:rFonts w:eastAsia="MS Mincho"/>
+          <w:bCs/>
+          <w:lang w:eastAsia="ja-JP"/>
+        </w:rPr>
+        <w:t>marian</w:t>
+      </w:r>
+      <w:proofErr w:type="spellEnd"/>
+      <w:r>
+        <w:rPr>
+          <w:rFonts w:eastAsia="MS Mincho"/>
+          <w:bCs/>
+          <w:lang w:eastAsia="ja-JP"/>
+        </w:rPr>
+        <w:t xml:space="preserve">, </w:t>
+      </w:r>
+      <w:proofErr w:type="spellStart"/>
+      <w:r>
+        <w:rPr>
+          <w:rFonts w:eastAsia="MS Mincho"/>
+          <w:bCs/>
+          <w:lang w:eastAsia="ja-JP"/>
+        </w:rPr>
+        <w:t>malia</w:t>
+      </w:r>
+      <w:proofErr w:type="spellEnd"/>
+      <w:r>
+        <w:rPr>
+          <w:rFonts w:eastAsia="MS Mincho"/>
+          <w:bCs/>
+          <w:lang w:eastAsia="ja-JP"/>
+        </w:rPr>
+        <w:t xml:space="preserve">), </w:t>
+      </w:r>
+      <w:proofErr w:type="spellStart"/>
+      <w:r>
+        <w:rPr>
+          <w:rFonts w:eastAsia="MS Mincho"/>
+          <w:b/>
+          <w:lang w:eastAsia="ja-JP"/>
+        </w:rPr>
+        <w:t>grandmotherOf</w:t>
+      </w:r>
+      <w:proofErr w:type="spellEnd"/>
+      <w:r>
+        <w:rPr>
+          <w:rFonts w:eastAsia="MS Mincho"/>
+          <w:b/>
+          <w:lang w:eastAsia="ja-JP"/>
+        </w:rPr>
+        <w:t>(</w:t>
+      </w:r>
+      <w:proofErr w:type="spellStart"/>
+      <w:r>
+        <w:rPr>
+          <w:rFonts w:eastAsia="MS Mincho"/>
+          <w:b/>
+          <w:lang w:eastAsia="ja-JP"/>
+        </w:rPr>
+        <w:t>ann</w:t>
+      </w:r>
+      <w:proofErr w:type="spellEnd"/>
+      <w:r>
+        <w:rPr>
+          <w:rFonts w:eastAsia="MS Mincho"/>
+          <w:b/>
+          <w:lang w:eastAsia="ja-JP"/>
+        </w:rPr>
+        <w:t xml:space="preserve">, </w:t>
+      </w:r>
+      <w:proofErr w:type="spellStart"/>
+      <w:r>
+        <w:rPr>
+          <w:rFonts w:eastAsia="MS Mincho"/>
+          <w:b/>
+          <w:lang w:eastAsia="ja-JP"/>
+        </w:rPr>
+        <w:t>malia</w:t>
+      </w:r>
+      <w:proofErr w:type="spellEnd"/>
+      <w:r>
+        <w:rPr>
+          <w:rFonts w:eastAsia="MS Mincho"/>
+          <w:b/>
+          <w:lang w:eastAsia="ja-JP"/>
+        </w:rPr>
+        <w:t>)</w:t>
+      </w:r>
+      <w:r>
+        <w:rPr>
+          <w:rFonts w:eastAsia="MS Mincho"/>
+          <w:bCs/>
+          <w:lang w:eastAsia="ja-JP"/>
+        </w:rPr>
+        <w:t xml:space="preserve">, </w:t>
+      </w:r>
+      <w:proofErr w:type="spellStart"/>
+      <w:r>
+        <w:rPr>
+          <w:rFonts w:eastAsia="MS Mincho"/>
+          <w:bCs/>
+          <w:lang w:eastAsia="ja-JP"/>
+        </w:rPr>
+        <w:t>uncleOf</w:t>
+      </w:r>
+      <w:proofErr w:type="spellEnd"/>
+      <w:r>
+        <w:rPr>
+          <w:rFonts w:eastAsia="MS Mincho"/>
+          <w:bCs/>
+          <w:lang w:eastAsia="ja-JP"/>
+        </w:rPr>
+        <w:t xml:space="preserve">(craig, </w:t>
+      </w:r>
+      <w:proofErr w:type="spellStart"/>
+      <w:r>
+        <w:rPr>
+          <w:rFonts w:eastAsia="MS Mincho"/>
+          <w:bCs/>
+          <w:lang w:eastAsia="ja-JP"/>
+        </w:rPr>
+        <w:t>malia</w:t>
+      </w:r>
+      <w:proofErr w:type="spellEnd"/>
+      <w:r>
+        <w:rPr>
+          <w:rFonts w:eastAsia="MS Mincho"/>
+          <w:bCs/>
+          <w:lang w:eastAsia="ja-JP"/>
+        </w:rPr>
+        <w:t xml:space="preserve">), </w:t>
+      </w:r>
+      <w:proofErr w:type="spellStart"/>
+      <w:r>
+        <w:rPr>
+          <w:rFonts w:eastAsia="MS Mincho"/>
+          <w:bCs/>
+          <w:lang w:eastAsia="ja-JP"/>
+        </w:rPr>
+        <w:t>uncleOf</w:t>
+      </w:r>
+      <w:proofErr w:type="spellEnd"/>
+      <w:r>
+        <w:rPr>
+          <w:rFonts w:eastAsia="MS Mincho"/>
+          <w:bCs/>
+          <w:lang w:eastAsia="ja-JP"/>
+        </w:rPr>
+        <w:t xml:space="preserve">(craig, </w:t>
+      </w:r>
+      <w:proofErr w:type="spellStart"/>
+      <w:r>
+        <w:rPr>
+          <w:rFonts w:eastAsia="MS Mincho"/>
+          <w:bCs/>
+          <w:lang w:eastAsia="ja-JP"/>
+        </w:rPr>
+        <w:t>natasha</w:t>
+      </w:r>
+      <w:proofErr w:type="spellEnd"/>
+      <w:r>
+        <w:rPr>
+          <w:rFonts w:eastAsia="MS Mincho"/>
+          <w:bCs/>
+          <w:lang w:eastAsia="ja-JP"/>
+        </w:rPr>
+        <w:t>)</w:t>
       </w:r>
       <w:r>
         <w:rPr>
@@ -1123,7 +4017,7 @@
         <w:pStyle w:val="BodyText"/>
         <w:spacing w:line="480" w:lineRule="auto"/>
         <w:rPr>
-          <w:rFonts w:eastAsia="MS Mincho"/>
+          <w:rFonts w:eastAsia="MS Mincho" w:hint="eastAsia"/>
           <w:bCs/>
           <w:lang w:eastAsia="ja-JP"/>
         </w:rPr>
@@ -1134,75 +4028,60 @@
           <w:bCs/>
           <w:lang w:eastAsia="ja-JP"/>
         </w:rPr>
-        <w:t xml:space="preserve">T P ↑ 2 = {p(a, b), </w:t>
-      </w:r>
-      <w:r>
-        <w:rPr>
-          <w:rFonts w:eastAsia="MS Mincho"/>
-          <w:bCs/>
-          <w:lang w:eastAsia="ja-JP"/>
-        </w:rPr>
-        <w:t>p(b, c), p(c, a), p(d, d)</w:t>
-      </w:r>
-      <w:r>
-        <w:rPr>
-          <w:rFonts w:eastAsia="MS Mincho"/>
-          <w:bCs/>
-          <w:lang w:eastAsia="ja-JP"/>
-        </w:rPr>
-        <w:t>, q(a, b), q(b, c), q(c, a), q(d, d)</w:t>
-      </w:r>
-      <w:r>
-        <w:rPr>
-          <w:rFonts w:eastAsia="MS Mincho"/>
-          <w:bCs/>
-          <w:lang w:eastAsia="ja-JP"/>
-        </w:rPr>
-        <w:t>}</w:t>
-      </w:r>
-    </w:p>
-    <w:p>
-      <w:pPr>
-        <w:pStyle w:val="BodyText"/>
-        <w:spacing w:line="480" w:lineRule="auto"/>
-        <w:rPr>
-          <w:rFonts w:eastAsia="MS Mincho"/>
-          <w:bCs/>
-          <w:lang w:eastAsia="ja-JP"/>
-        </w:rPr>
-      </w:pPr>
-      <w:r>
-        <w:rPr>
-          <w:rFonts w:eastAsia="MS Mincho"/>
-          <w:bCs/>
-          <w:lang w:eastAsia="ja-JP"/>
-        </w:rPr>
-        <w:t xml:space="preserve">T P ↑ </w:t>
-      </w:r>
-      <w:r>
-        <w:rPr>
-          <w:rFonts w:eastAsia="MS Mincho"/>
-          <w:bCs/>
-          <w:lang w:eastAsia="ja-JP"/>
-        </w:rPr>
-        <w:t>3</w:t>
-      </w:r>
-      <w:r>
-        <w:rPr>
-          <w:rFonts w:eastAsia="MS Mincho"/>
-          <w:bCs/>
-          <w:lang w:eastAsia="ja-JP"/>
-        </w:rPr>
-        <w:t xml:space="preserve"> = {p(a, b), </w:t>
-      </w:r>
-      <w:r>
-        <w:rPr>
-          <w:rFonts w:eastAsia="MS Mincho"/>
-          <w:bCs/>
-          <w:lang w:eastAsia="ja-JP"/>
-        </w:rPr>
-        <w:t>p(b, c), p(c, a), p(d, d), q(a, b)</w:t>
-      </w:r>
+        <w:t>T P ↑ ω</w:t>
+      </w:r>
+      <w:r>
+        <w:rPr>
+          <w:rFonts w:eastAsia="MS Mincho"/>
+          <w:bCs/>
+          <w:lang w:eastAsia="ja-JP"/>
+        </w:rPr>
+        <w:t xml:space="preserve"> </w:t>
+      </w:r>
+      <w:r>
+        <w:rPr>
+          <w:rFonts w:eastAsia="MS Mincho"/>
+          <w:bCs/>
+          <w:lang w:eastAsia="ja-JP"/>
+        </w:rPr>
+        <w:t>=</w:t>
+      </w:r>
+      <w:r>
+        <w:rPr>
+          <w:rFonts w:eastAsia="MS Mincho"/>
+          <w:bCs/>
+          <w:lang w:eastAsia="ja-JP"/>
+        </w:rPr>
+        <w:t xml:space="preserve"> {</w:t>
+      </w:r>
+      <w:proofErr w:type="spellStart"/>
+      <w:r>
+        <w:rPr>
+          <w:rFonts w:eastAsia="MS Mincho"/>
+          <w:bCs/>
+          <w:lang w:eastAsia="ja-JP"/>
+        </w:rPr>
+        <w:t>motherOf</w:t>
+      </w:r>
+      <w:proofErr w:type="spellEnd"/>
+      <w:r>
+        <w:rPr>
+          <w:rFonts w:eastAsia="MS Mincho"/>
+          <w:bCs/>
+          <w:lang w:eastAsia="ja-JP"/>
+        </w:rPr>
+        <w:t>(</w:t>
+      </w:r>
+      <w:proofErr w:type="spellStart"/>
+      <w:r>
+        <w:rPr>
+          <w:rFonts w:eastAsia="MS Mincho"/>
+          <w:bCs/>
+          <w:lang w:eastAsia="ja-JP"/>
+        </w:rPr>
+        <w:t>marian</w:t>
+      </w:r>
+      <w:proofErr w:type="spellEnd"/>
       <w:r>
         <w:rPr>
           <w:rFonts w:eastAsia="MS Mincho"/>
@@ -1211,140 +4090,120 @@
         </w:rPr>
         <w:t xml:space="preserve">, </w:t>
       </w:r>
-      <w:r>
-        <w:rPr>
-          <w:rFonts w:eastAsia="MS Mincho"/>
-          <w:bCs/>
-          <w:lang w:eastAsia="ja-JP"/>
-        </w:rPr>
-        <w:t>q(b, c), q(c, a), q(d, d)</w:t>
-      </w:r>
-      <w:r>
-        <w:rPr>
-          <w:rFonts w:eastAsia="MS Mincho"/>
-          <w:bCs/>
-          <w:lang w:eastAsia="ja-JP"/>
-        </w:rPr>
-        <w:t>, q(a, c), q(b, a), q(c, b)</w:t>
-      </w:r>
-      <w:r>
-        <w:rPr>
-          <w:rFonts w:eastAsia="MS Mincho"/>
-          <w:bCs/>
-          <w:lang w:eastAsia="ja-JP"/>
-        </w:rPr>
-        <w:t>, r(a, b), r(b, c), r(c, a), r(d, d)</w:t>
-      </w:r>
-      <w:r>
-        <w:rPr>
-          <w:rFonts w:eastAsia="MS Mincho"/>
-          <w:bCs/>
-          <w:lang w:eastAsia="ja-JP"/>
-        </w:rPr>
-        <w:t>}</w:t>
-      </w:r>
-    </w:p>
-    <w:p>
-      <w:pPr>
-        <w:pStyle w:val="BodyText"/>
-        <w:spacing w:line="480" w:lineRule="auto"/>
-        <w:rPr>
-          <w:rFonts w:eastAsia="MS Mincho"/>
-          <w:bCs/>
-          <w:lang w:eastAsia="ja-JP"/>
-        </w:rPr>
-      </w:pPr>
-      <w:r>
-        <w:rPr>
-          <w:rFonts w:eastAsia="MS Mincho"/>
-          <w:bCs/>
-          <w:lang w:eastAsia="ja-JP"/>
-        </w:rPr>
-        <w:t xml:space="preserve">T P ↑ </w:t>
-      </w:r>
-      <w:r>
-        <w:rPr>
-          <w:rFonts w:eastAsia="MS Mincho"/>
-          <w:bCs/>
-          <w:lang w:eastAsia="ja-JP"/>
-        </w:rPr>
-        <w:t>4</w:t>
-      </w:r>
-      <w:r>
-        <w:rPr>
-          <w:rFonts w:eastAsia="MS Mincho"/>
-          <w:bCs/>
-          <w:lang w:eastAsia="ja-JP"/>
-        </w:rPr>
-        <w:t xml:space="preserve"> = {p(a, b), </w:t>
-      </w:r>
-      <w:r>
-        <w:rPr>
-          <w:rFonts w:eastAsia="MS Mincho"/>
-          <w:bCs/>
-          <w:lang w:eastAsia="ja-JP"/>
-        </w:rPr>
-        <w:t>p(b, c), p(c, a), p(d, d), q(a, b), q(b, c), q(c, a), q(d, d), q(a, c), q(b, a), q(c, b), r(a, b), r(b, c), r(c, a), r(d, d)</w:t>
-      </w:r>
-      <w:r>
-        <w:rPr>
-          <w:rFonts w:eastAsia="MS Mincho"/>
-          <w:bCs/>
-          <w:lang w:eastAsia="ja-JP"/>
-        </w:rPr>
-        <w:t>, r(a, c), r(b, a), r(c, b), r(b, a), r(c, b), r(a, c), t(d)</w:t>
-      </w:r>
-      <w:r>
-        <w:rPr>
-          <w:rFonts w:eastAsia="MS Mincho"/>
-          <w:bCs/>
-          <w:lang w:eastAsia="ja-JP"/>
-        </w:rPr>
-        <w:t>}</w:t>
-      </w:r>
-    </w:p>
-    <w:p>
-      <w:pPr>
-        <w:pStyle w:val="BodyText"/>
-        <w:spacing w:line="480" w:lineRule="auto"/>
-        <w:rPr>
-          <w:rFonts w:eastAsia="MS Mincho"/>
-          <w:bCs/>
-          <w:lang w:eastAsia="ja-JP"/>
-        </w:rPr>
-      </w:pPr>
-      <w:r>
-        <w:rPr>
-          <w:rFonts w:eastAsia="MS Mincho"/>
-          <w:bCs/>
-          <w:lang w:eastAsia="ja-JP"/>
-        </w:rPr>
-        <w:t xml:space="preserve">T P ↑ </w:t>
-      </w:r>
-      <w:r>
-        <w:rPr>
-          <w:rFonts w:eastAsia="MS Mincho"/>
-          <w:bCs/>
-          <w:lang w:eastAsia="ja-JP"/>
-        </w:rPr>
-        <w:t>5</w:t>
-      </w:r>
-      <w:r>
-        <w:rPr>
-          <w:rFonts w:eastAsia="MS Mincho"/>
-          <w:bCs/>
-          <w:lang w:eastAsia="ja-JP"/>
-        </w:rPr>
-        <w:t xml:space="preserve"> = {p(a, b), </w:t>
-      </w:r>
-      <w:r>
-        <w:rPr>
-          <w:rFonts w:eastAsia="MS Mincho"/>
-          <w:bCs/>
-          <w:lang w:eastAsia="ja-JP"/>
-        </w:rPr>
-        <w:t>p(b, c), p(c, a), p(d, d), q(a, b), q(b, c), q(c, a), q(d, d), q(a, c), q(b, a), q(c, b), r(a, b), r(b, c), r(c, a), r(d, d), r(a, c), r(b, a), r(c, b)</w:t>
-      </w:r>
+      <w:proofErr w:type="spellStart"/>
+      <w:r>
+        <w:rPr>
+          <w:rFonts w:eastAsia="MS Mincho"/>
+          <w:bCs/>
+          <w:lang w:eastAsia="ja-JP"/>
+        </w:rPr>
+        <w:t>michelle</w:t>
+      </w:r>
+      <w:proofErr w:type="spellEnd"/>
+      <w:r>
+        <w:rPr>
+          <w:rFonts w:eastAsia="MS Mincho"/>
+          <w:bCs/>
+          <w:lang w:eastAsia="ja-JP"/>
+        </w:rPr>
+        <w:t>)</w:t>
+      </w:r>
+      <w:r>
+        <w:rPr>
+          <w:rFonts w:eastAsia="MS Mincho"/>
+          <w:bCs/>
+          <w:lang w:eastAsia="ja-JP"/>
+        </w:rPr>
+        <w:t>,</w:t>
+      </w:r>
+      <w:r>
+        <w:rPr>
+          <w:rFonts w:eastAsia="MS Mincho"/>
+          <w:bCs/>
+          <w:lang w:eastAsia="ja-JP"/>
+        </w:rPr>
+        <w:t xml:space="preserve"> </w:t>
+      </w:r>
+      <w:proofErr w:type="spellStart"/>
+      <w:r>
+        <w:rPr>
+          <w:rFonts w:eastAsia="MS Mincho"/>
+          <w:bCs/>
+          <w:lang w:eastAsia="ja-JP"/>
+        </w:rPr>
+        <w:t>brotherOf</w:t>
+      </w:r>
+      <w:proofErr w:type="spellEnd"/>
+      <w:r>
+        <w:rPr>
+          <w:rFonts w:eastAsia="MS Mincho"/>
+          <w:bCs/>
+          <w:lang w:eastAsia="ja-JP"/>
+        </w:rPr>
+        <w:t xml:space="preserve">(craig, </w:t>
+      </w:r>
+      <w:proofErr w:type="spellStart"/>
+      <w:r>
+        <w:rPr>
+          <w:rFonts w:eastAsia="MS Mincho"/>
+          <w:bCs/>
+          <w:lang w:eastAsia="ja-JP"/>
+        </w:rPr>
+        <w:t>michelle</w:t>
+      </w:r>
+      <w:proofErr w:type="spellEnd"/>
+      <w:r>
+        <w:rPr>
+          <w:rFonts w:eastAsia="MS Mincho"/>
+          <w:bCs/>
+          <w:lang w:eastAsia="ja-JP"/>
+        </w:rPr>
+        <w:t>)</w:t>
+      </w:r>
+      <w:r>
+        <w:rPr>
+          <w:rFonts w:eastAsia="MS Mincho"/>
+          <w:bCs/>
+          <w:lang w:eastAsia="ja-JP"/>
+        </w:rPr>
+        <w:t>,</w:t>
+      </w:r>
+      <w:r>
+        <w:rPr>
+          <w:rFonts w:eastAsia="MS Mincho"/>
+          <w:bCs/>
+          <w:lang w:eastAsia="ja-JP"/>
+        </w:rPr>
+        <w:t xml:space="preserve"> </w:t>
+      </w:r>
+      <w:proofErr w:type="spellStart"/>
+      <w:r>
+        <w:rPr>
+          <w:rFonts w:eastAsia="MS Mincho"/>
+          <w:bCs/>
+          <w:lang w:eastAsia="ja-JP"/>
+        </w:rPr>
+        <w:t>motherOf</w:t>
+      </w:r>
+      <w:proofErr w:type="spellEnd"/>
+      <w:r>
+        <w:rPr>
+          <w:rFonts w:eastAsia="MS Mincho"/>
+          <w:bCs/>
+          <w:lang w:eastAsia="ja-JP"/>
+        </w:rPr>
+        <w:t>(</w:t>
+      </w:r>
+      <w:proofErr w:type="spellStart"/>
+      <w:r>
+        <w:rPr>
+          <w:rFonts w:eastAsia="MS Mincho"/>
+          <w:bCs/>
+          <w:lang w:eastAsia="ja-JP"/>
+        </w:rPr>
+        <w:t>ann</w:t>
+      </w:r>
+      <w:proofErr w:type="spellEnd"/>
       <w:r>
         <w:rPr>
           <w:rFonts w:eastAsia="MS Mincho"/>
@@ -1353,64 +4212,972 @@
         </w:rPr>
         <w:t xml:space="preserve">, </w:t>
       </w:r>
-      <w:r>
-        <w:rPr>
-          <w:rFonts w:eastAsia="MS Mincho"/>
-          <w:bCs/>
-          <w:lang w:eastAsia="ja-JP"/>
-        </w:rPr>
-        <w:t>t(d)</w:t>
-      </w:r>
-      <w:r>
-        <w:rPr>
-          <w:rFonts w:eastAsia="MS Mincho"/>
-          <w:bCs/>
-          <w:lang w:eastAsia="ja-JP"/>
-        </w:rPr>
-        <w:t>}</w:t>
-      </w:r>
-    </w:p>
-    <w:p>
-      <w:pPr>
-        <w:pStyle w:val="BodyText"/>
-        <w:spacing w:line="480" w:lineRule="auto"/>
-        <w:rPr>
-          <w:rFonts w:eastAsia="MS Mincho"/>
-          <w:bCs/>
-          <w:lang w:eastAsia="ja-JP"/>
-        </w:rPr>
-      </w:pPr>
-      <w:r>
-        <w:rPr>
-          <w:rFonts w:eastAsia="MS Mincho"/>
-          <w:bCs/>
-          <w:lang w:eastAsia="ja-JP"/>
-        </w:rPr>
-        <w:t xml:space="preserve">T P ↑ ω = </w:t>
-      </w:r>
-      <w:r>
-        <w:rPr>
-          <w:rFonts w:eastAsia="MS Mincho"/>
-          <w:bCs/>
-          <w:lang w:eastAsia="ja-JP"/>
-        </w:rPr>
-        <w:t xml:space="preserve">{p(a, b), </w:t>
-      </w:r>
-      <w:r>
-        <w:rPr>
-          <w:rFonts w:eastAsia="MS Mincho"/>
-          <w:bCs/>
-          <w:lang w:eastAsia="ja-JP"/>
-        </w:rPr>
-        <w:t>p(b, c), p(c, a), p(d, d), q(a, b), q(b, c), q(c, a), q(d, d), q(a, c), q(b, a), q(c, b), r(a, b), r(b, c), r(c, a), r(d, d), r(a, c), r(b, a), r(c, b), t(d)</w:t>
-      </w:r>
-      <w:r>
-        <w:rPr>
-          <w:rFonts w:eastAsia="MS Mincho"/>
-          <w:bCs/>
-          <w:lang w:eastAsia="ja-JP"/>
-        </w:rPr>
-        <w:t>}</w:t>
+      <w:proofErr w:type="spellStart"/>
+      <w:r>
+        <w:rPr>
+          <w:rFonts w:eastAsia="MS Mincho"/>
+          <w:bCs/>
+          <w:lang w:eastAsia="ja-JP"/>
+        </w:rPr>
+        <w:t>barack</w:t>
+      </w:r>
+      <w:proofErr w:type="spellEnd"/>
+      <w:r>
+        <w:rPr>
+          <w:rFonts w:eastAsia="MS Mincho"/>
+          <w:bCs/>
+          <w:lang w:eastAsia="ja-JP"/>
+        </w:rPr>
+        <w:t>)</w:t>
+      </w:r>
+      <w:r>
+        <w:rPr>
+          <w:rFonts w:eastAsia="MS Mincho"/>
+          <w:bCs/>
+          <w:lang w:eastAsia="ja-JP"/>
+        </w:rPr>
+        <w:t xml:space="preserve">, </w:t>
+      </w:r>
+      <w:proofErr w:type="spellStart"/>
+      <w:r>
+        <w:rPr>
+          <w:rFonts w:eastAsia="MS Mincho"/>
+          <w:bCs/>
+          <w:lang w:eastAsia="ja-JP"/>
+        </w:rPr>
+        <w:t>fatherOf</w:t>
+      </w:r>
+      <w:proofErr w:type="spellEnd"/>
+      <w:r>
+        <w:rPr>
+          <w:rFonts w:eastAsia="MS Mincho"/>
+          <w:bCs/>
+          <w:lang w:eastAsia="ja-JP"/>
+        </w:rPr>
+        <w:t>(</w:t>
+      </w:r>
+      <w:proofErr w:type="spellStart"/>
+      <w:r>
+        <w:rPr>
+          <w:rFonts w:eastAsia="MS Mincho"/>
+          <w:bCs/>
+          <w:lang w:eastAsia="ja-JP"/>
+        </w:rPr>
+        <w:t>barack</w:t>
+      </w:r>
+      <w:proofErr w:type="spellEnd"/>
+      <w:r>
+        <w:rPr>
+          <w:rFonts w:eastAsia="MS Mincho"/>
+          <w:bCs/>
+          <w:lang w:eastAsia="ja-JP"/>
+        </w:rPr>
+        <w:t xml:space="preserve">, </w:t>
+      </w:r>
+      <w:proofErr w:type="spellStart"/>
+      <w:r>
+        <w:rPr>
+          <w:rFonts w:eastAsia="MS Mincho"/>
+          <w:bCs/>
+          <w:lang w:eastAsia="ja-JP"/>
+        </w:rPr>
+        <w:t>malia</w:t>
+      </w:r>
+      <w:proofErr w:type="spellEnd"/>
+      <w:r>
+        <w:rPr>
+          <w:rFonts w:eastAsia="MS Mincho"/>
+          <w:bCs/>
+          <w:lang w:eastAsia="ja-JP"/>
+        </w:rPr>
+        <w:t>)</w:t>
+      </w:r>
+      <w:r>
+        <w:rPr>
+          <w:rFonts w:eastAsia="MS Mincho"/>
+          <w:bCs/>
+          <w:lang w:eastAsia="ja-JP"/>
+        </w:rPr>
+        <w:t xml:space="preserve">, </w:t>
+      </w:r>
+      <w:proofErr w:type="spellStart"/>
+      <w:r>
+        <w:rPr>
+          <w:rFonts w:eastAsia="MS Mincho"/>
+          <w:bCs/>
+          <w:lang w:eastAsia="ja-JP"/>
+        </w:rPr>
+        <w:t>motherOf</w:t>
+      </w:r>
+      <w:proofErr w:type="spellEnd"/>
+      <w:r>
+        <w:rPr>
+          <w:rFonts w:eastAsia="MS Mincho"/>
+          <w:bCs/>
+          <w:lang w:eastAsia="ja-JP"/>
+        </w:rPr>
+        <w:t>(</w:t>
+      </w:r>
+      <w:proofErr w:type="spellStart"/>
+      <w:r>
+        <w:rPr>
+          <w:rFonts w:eastAsia="MS Mincho"/>
+          <w:bCs/>
+          <w:lang w:eastAsia="ja-JP"/>
+        </w:rPr>
+        <w:t>michelle</w:t>
+      </w:r>
+      <w:proofErr w:type="spellEnd"/>
+      <w:r>
+        <w:rPr>
+          <w:rFonts w:eastAsia="MS Mincho"/>
+          <w:bCs/>
+          <w:lang w:eastAsia="ja-JP"/>
+        </w:rPr>
+        <w:t xml:space="preserve">, </w:t>
+      </w:r>
+      <w:proofErr w:type="spellStart"/>
+      <w:r>
+        <w:rPr>
+          <w:rFonts w:eastAsia="MS Mincho"/>
+          <w:bCs/>
+          <w:lang w:eastAsia="ja-JP"/>
+        </w:rPr>
+        <w:t>malia</w:t>
+      </w:r>
+      <w:proofErr w:type="spellEnd"/>
+      <w:r>
+        <w:rPr>
+          <w:rFonts w:eastAsia="MS Mincho"/>
+          <w:bCs/>
+          <w:lang w:eastAsia="ja-JP"/>
+        </w:rPr>
+        <w:t>)</w:t>
+      </w:r>
+      <w:r>
+        <w:rPr>
+          <w:rFonts w:eastAsia="MS Mincho"/>
+          <w:bCs/>
+          <w:lang w:eastAsia="ja-JP"/>
+        </w:rPr>
+        <w:t>,</w:t>
+      </w:r>
+      <w:r>
+        <w:rPr>
+          <w:rFonts w:eastAsia="MS Mincho"/>
+          <w:bCs/>
+          <w:lang w:eastAsia="ja-JP"/>
+        </w:rPr>
+        <w:t xml:space="preserve"> </w:t>
+      </w:r>
+      <w:proofErr w:type="spellStart"/>
+      <w:r>
+        <w:rPr>
+          <w:rFonts w:eastAsia="MS Mincho"/>
+          <w:bCs/>
+          <w:lang w:eastAsia="ja-JP"/>
+        </w:rPr>
+        <w:t>fatherOf</w:t>
+      </w:r>
+      <w:proofErr w:type="spellEnd"/>
+      <w:r>
+        <w:rPr>
+          <w:rFonts w:eastAsia="MS Mincho"/>
+          <w:bCs/>
+          <w:lang w:eastAsia="ja-JP"/>
+        </w:rPr>
+        <w:t>(</w:t>
+      </w:r>
+      <w:proofErr w:type="spellStart"/>
+      <w:r>
+        <w:rPr>
+          <w:rFonts w:eastAsia="MS Mincho"/>
+          <w:bCs/>
+          <w:lang w:eastAsia="ja-JP"/>
+        </w:rPr>
+        <w:t>barack</w:t>
+      </w:r>
+      <w:proofErr w:type="spellEnd"/>
+      <w:r>
+        <w:rPr>
+          <w:rFonts w:eastAsia="MS Mincho"/>
+          <w:bCs/>
+          <w:lang w:eastAsia="ja-JP"/>
+        </w:rPr>
+        <w:t xml:space="preserve">, </w:t>
+      </w:r>
+      <w:proofErr w:type="spellStart"/>
+      <w:r>
+        <w:rPr>
+          <w:rFonts w:eastAsia="MS Mincho"/>
+          <w:bCs/>
+          <w:lang w:eastAsia="ja-JP"/>
+        </w:rPr>
+        <w:t>natasha</w:t>
+      </w:r>
+      <w:proofErr w:type="spellEnd"/>
+      <w:r>
+        <w:rPr>
+          <w:rFonts w:eastAsia="MS Mincho"/>
+          <w:bCs/>
+          <w:lang w:eastAsia="ja-JP"/>
+        </w:rPr>
+        <w:t>)</w:t>
+      </w:r>
+      <w:r>
+        <w:rPr>
+          <w:rFonts w:eastAsia="MS Mincho"/>
+          <w:bCs/>
+          <w:lang w:eastAsia="ja-JP"/>
+        </w:rPr>
+        <w:t>,</w:t>
+      </w:r>
+      <w:r>
+        <w:rPr>
+          <w:rFonts w:eastAsia="MS Mincho"/>
+          <w:bCs/>
+          <w:lang w:eastAsia="ja-JP"/>
+        </w:rPr>
+        <w:t xml:space="preserve"> </w:t>
+      </w:r>
+      <w:proofErr w:type="spellStart"/>
+      <w:r>
+        <w:rPr>
+          <w:rFonts w:eastAsia="MS Mincho"/>
+          <w:bCs/>
+          <w:lang w:eastAsia="ja-JP"/>
+        </w:rPr>
+        <w:t>motherOf</w:t>
+      </w:r>
+      <w:proofErr w:type="spellEnd"/>
+      <w:r>
+        <w:rPr>
+          <w:rFonts w:eastAsia="MS Mincho"/>
+          <w:bCs/>
+          <w:lang w:eastAsia="ja-JP"/>
+        </w:rPr>
+        <w:t>(</w:t>
+      </w:r>
+      <w:proofErr w:type="spellStart"/>
+      <w:r>
+        <w:rPr>
+          <w:rFonts w:eastAsia="MS Mincho"/>
+          <w:bCs/>
+          <w:lang w:eastAsia="ja-JP"/>
+        </w:rPr>
+        <w:t>michelle</w:t>
+      </w:r>
+      <w:proofErr w:type="spellEnd"/>
+      <w:r>
+        <w:rPr>
+          <w:rFonts w:eastAsia="MS Mincho"/>
+          <w:bCs/>
+          <w:lang w:eastAsia="ja-JP"/>
+        </w:rPr>
+        <w:t xml:space="preserve">, </w:t>
+      </w:r>
+      <w:proofErr w:type="spellStart"/>
+      <w:r>
+        <w:rPr>
+          <w:rFonts w:eastAsia="MS Mincho"/>
+          <w:bCs/>
+          <w:lang w:eastAsia="ja-JP"/>
+        </w:rPr>
+        <w:t>natasha</w:t>
+      </w:r>
+      <w:proofErr w:type="spellEnd"/>
+      <w:r>
+        <w:rPr>
+          <w:rFonts w:eastAsia="MS Mincho"/>
+          <w:bCs/>
+          <w:lang w:eastAsia="ja-JP"/>
+        </w:rPr>
+        <w:t>)</w:t>
+      </w:r>
+      <w:r>
+        <w:rPr>
+          <w:rFonts w:eastAsia="MS Mincho"/>
+          <w:bCs/>
+          <w:lang w:eastAsia="ja-JP"/>
+        </w:rPr>
+        <w:t>,</w:t>
+      </w:r>
+      <w:r>
+        <w:rPr>
+          <w:rFonts w:eastAsia="MS Mincho"/>
+          <w:bCs/>
+          <w:lang w:eastAsia="ja-JP"/>
+        </w:rPr>
+        <w:t xml:space="preserve"> male(craig)</w:t>
+      </w:r>
+      <w:r>
+        <w:rPr>
+          <w:rFonts w:eastAsia="MS Mincho"/>
+          <w:bCs/>
+          <w:lang w:eastAsia="ja-JP"/>
+        </w:rPr>
+        <w:t>,</w:t>
+      </w:r>
+      <w:r>
+        <w:rPr>
+          <w:rFonts w:eastAsia="MS Mincho"/>
+          <w:bCs/>
+          <w:lang w:eastAsia="ja-JP"/>
+        </w:rPr>
+        <w:t xml:space="preserve"> female(</w:t>
+      </w:r>
+      <w:proofErr w:type="spellStart"/>
+      <w:r>
+        <w:rPr>
+          <w:rFonts w:eastAsia="MS Mincho"/>
+          <w:bCs/>
+          <w:lang w:eastAsia="ja-JP"/>
+        </w:rPr>
+        <w:t>natasha</w:t>
+      </w:r>
+      <w:proofErr w:type="spellEnd"/>
+      <w:r>
+        <w:rPr>
+          <w:rFonts w:eastAsia="MS Mincho"/>
+          <w:bCs/>
+          <w:lang w:eastAsia="ja-JP"/>
+        </w:rPr>
+        <w:t>)</w:t>
+      </w:r>
+      <w:r>
+        <w:rPr>
+          <w:rFonts w:eastAsia="MS Mincho"/>
+          <w:bCs/>
+          <w:lang w:eastAsia="ja-JP"/>
+        </w:rPr>
+        <w:t xml:space="preserve">, </w:t>
+      </w:r>
+      <w:proofErr w:type="spellStart"/>
+      <w:r>
+        <w:rPr>
+          <w:rFonts w:eastAsia="MS Mincho"/>
+          <w:bCs/>
+          <w:lang w:eastAsia="ja-JP"/>
+        </w:rPr>
+        <w:t>parentOf</w:t>
+      </w:r>
+      <w:proofErr w:type="spellEnd"/>
+      <w:r>
+        <w:rPr>
+          <w:rFonts w:eastAsia="MS Mincho"/>
+          <w:bCs/>
+          <w:lang w:eastAsia="ja-JP"/>
+        </w:rPr>
+        <w:t>(</w:t>
+      </w:r>
+      <w:proofErr w:type="spellStart"/>
+      <w:r>
+        <w:rPr>
+          <w:rFonts w:eastAsia="MS Mincho"/>
+          <w:bCs/>
+          <w:lang w:eastAsia="ja-JP"/>
+        </w:rPr>
+        <w:t>marian</w:t>
+      </w:r>
+      <w:proofErr w:type="spellEnd"/>
+      <w:r>
+        <w:rPr>
+          <w:rFonts w:eastAsia="MS Mincho"/>
+          <w:bCs/>
+          <w:lang w:eastAsia="ja-JP"/>
+        </w:rPr>
+        <w:t xml:space="preserve">, </w:t>
+      </w:r>
+      <w:proofErr w:type="spellStart"/>
+      <w:r>
+        <w:rPr>
+          <w:rFonts w:eastAsia="MS Mincho"/>
+          <w:bCs/>
+          <w:lang w:eastAsia="ja-JP"/>
+        </w:rPr>
+        <w:t>michelle</w:t>
+      </w:r>
+      <w:proofErr w:type="spellEnd"/>
+      <w:r>
+        <w:rPr>
+          <w:rFonts w:eastAsia="MS Mincho"/>
+          <w:bCs/>
+          <w:lang w:eastAsia="ja-JP"/>
+        </w:rPr>
+        <w:t xml:space="preserve">), </w:t>
+      </w:r>
+      <w:proofErr w:type="spellStart"/>
+      <w:r>
+        <w:rPr>
+          <w:rFonts w:eastAsia="MS Mincho"/>
+          <w:bCs/>
+          <w:lang w:eastAsia="ja-JP"/>
+        </w:rPr>
+        <w:t>parentOf</w:t>
+      </w:r>
+      <w:proofErr w:type="spellEnd"/>
+      <w:r>
+        <w:rPr>
+          <w:rFonts w:eastAsia="MS Mincho"/>
+          <w:bCs/>
+          <w:lang w:eastAsia="ja-JP"/>
+        </w:rPr>
+        <w:t>(</w:t>
+      </w:r>
+      <w:proofErr w:type="spellStart"/>
+      <w:r>
+        <w:rPr>
+          <w:rFonts w:eastAsia="MS Mincho"/>
+          <w:bCs/>
+          <w:lang w:eastAsia="ja-JP"/>
+        </w:rPr>
+        <w:t>ann</w:t>
+      </w:r>
+      <w:proofErr w:type="spellEnd"/>
+      <w:r>
+        <w:rPr>
+          <w:rFonts w:eastAsia="MS Mincho"/>
+          <w:bCs/>
+          <w:lang w:eastAsia="ja-JP"/>
+        </w:rPr>
+        <w:t xml:space="preserve">, </w:t>
+      </w:r>
+      <w:proofErr w:type="spellStart"/>
+      <w:r>
+        <w:rPr>
+          <w:rFonts w:eastAsia="MS Mincho"/>
+          <w:bCs/>
+          <w:lang w:eastAsia="ja-JP"/>
+        </w:rPr>
+        <w:t>barack</w:t>
+      </w:r>
+      <w:proofErr w:type="spellEnd"/>
+      <w:r>
+        <w:rPr>
+          <w:rFonts w:eastAsia="MS Mincho"/>
+          <w:bCs/>
+          <w:lang w:eastAsia="ja-JP"/>
+        </w:rPr>
+        <w:t xml:space="preserve">), </w:t>
+      </w:r>
+      <w:proofErr w:type="spellStart"/>
+      <w:r>
+        <w:rPr>
+          <w:rFonts w:eastAsia="MS Mincho"/>
+          <w:bCs/>
+          <w:lang w:eastAsia="ja-JP"/>
+        </w:rPr>
+        <w:t>parentOf</w:t>
+      </w:r>
+      <w:proofErr w:type="spellEnd"/>
+      <w:r>
+        <w:rPr>
+          <w:rFonts w:eastAsia="MS Mincho"/>
+          <w:bCs/>
+          <w:lang w:eastAsia="ja-JP"/>
+        </w:rPr>
+        <w:t>(</w:t>
+      </w:r>
+      <w:proofErr w:type="spellStart"/>
+      <w:r>
+        <w:rPr>
+          <w:rFonts w:eastAsia="MS Mincho"/>
+          <w:bCs/>
+          <w:lang w:eastAsia="ja-JP"/>
+        </w:rPr>
+        <w:t>barack</w:t>
+      </w:r>
+      <w:proofErr w:type="spellEnd"/>
+      <w:r>
+        <w:rPr>
+          <w:rFonts w:eastAsia="MS Mincho"/>
+          <w:bCs/>
+          <w:lang w:eastAsia="ja-JP"/>
+        </w:rPr>
+        <w:t xml:space="preserve">, </w:t>
+      </w:r>
+      <w:proofErr w:type="spellStart"/>
+      <w:r>
+        <w:rPr>
+          <w:rFonts w:eastAsia="MS Mincho"/>
+          <w:bCs/>
+          <w:lang w:eastAsia="ja-JP"/>
+        </w:rPr>
+        <w:t>malia</w:t>
+      </w:r>
+      <w:proofErr w:type="spellEnd"/>
+      <w:r>
+        <w:rPr>
+          <w:rFonts w:eastAsia="MS Mincho"/>
+          <w:bCs/>
+          <w:lang w:eastAsia="ja-JP"/>
+        </w:rPr>
+        <w:t xml:space="preserve">), </w:t>
+      </w:r>
+      <w:proofErr w:type="spellStart"/>
+      <w:r>
+        <w:rPr>
+          <w:rFonts w:eastAsia="MS Mincho"/>
+          <w:bCs/>
+          <w:lang w:eastAsia="ja-JP"/>
+        </w:rPr>
+        <w:t>parentOf</w:t>
+      </w:r>
+      <w:proofErr w:type="spellEnd"/>
+      <w:r>
+        <w:rPr>
+          <w:rFonts w:eastAsia="MS Mincho"/>
+          <w:bCs/>
+          <w:lang w:eastAsia="ja-JP"/>
+        </w:rPr>
+        <w:t>(</w:t>
+      </w:r>
+      <w:proofErr w:type="spellStart"/>
+      <w:r>
+        <w:rPr>
+          <w:rFonts w:eastAsia="MS Mincho"/>
+          <w:bCs/>
+          <w:lang w:eastAsia="ja-JP"/>
+        </w:rPr>
+        <w:t>michelle</w:t>
+      </w:r>
+      <w:proofErr w:type="spellEnd"/>
+      <w:r>
+        <w:rPr>
+          <w:rFonts w:eastAsia="MS Mincho"/>
+          <w:bCs/>
+          <w:lang w:eastAsia="ja-JP"/>
+        </w:rPr>
+        <w:t xml:space="preserve">, </w:t>
+      </w:r>
+      <w:proofErr w:type="spellStart"/>
+      <w:r>
+        <w:rPr>
+          <w:rFonts w:eastAsia="MS Mincho"/>
+          <w:bCs/>
+          <w:lang w:eastAsia="ja-JP"/>
+        </w:rPr>
+        <w:t>malia</w:t>
+      </w:r>
+      <w:proofErr w:type="spellEnd"/>
+      <w:r>
+        <w:rPr>
+          <w:rFonts w:eastAsia="MS Mincho"/>
+          <w:bCs/>
+          <w:lang w:eastAsia="ja-JP"/>
+        </w:rPr>
+        <w:t xml:space="preserve">), </w:t>
+      </w:r>
+      <w:proofErr w:type="spellStart"/>
+      <w:r>
+        <w:rPr>
+          <w:rFonts w:eastAsia="MS Mincho"/>
+          <w:bCs/>
+          <w:lang w:eastAsia="ja-JP"/>
+        </w:rPr>
+        <w:t>parentOf</w:t>
+      </w:r>
+      <w:proofErr w:type="spellEnd"/>
+      <w:r>
+        <w:rPr>
+          <w:rFonts w:eastAsia="MS Mincho"/>
+          <w:bCs/>
+          <w:lang w:eastAsia="ja-JP"/>
+        </w:rPr>
+        <w:t>(</w:t>
+      </w:r>
+      <w:proofErr w:type="spellStart"/>
+      <w:r>
+        <w:rPr>
+          <w:rFonts w:eastAsia="MS Mincho"/>
+          <w:bCs/>
+          <w:lang w:eastAsia="ja-JP"/>
+        </w:rPr>
+        <w:t>barack</w:t>
+      </w:r>
+      <w:proofErr w:type="spellEnd"/>
+      <w:r>
+        <w:rPr>
+          <w:rFonts w:eastAsia="MS Mincho"/>
+          <w:bCs/>
+          <w:lang w:eastAsia="ja-JP"/>
+        </w:rPr>
+        <w:t xml:space="preserve">, </w:t>
+      </w:r>
+      <w:proofErr w:type="spellStart"/>
+      <w:r>
+        <w:rPr>
+          <w:rFonts w:eastAsia="MS Mincho"/>
+          <w:bCs/>
+          <w:lang w:eastAsia="ja-JP"/>
+        </w:rPr>
+        <w:t>natasha</w:t>
+      </w:r>
+      <w:proofErr w:type="spellEnd"/>
+      <w:r>
+        <w:rPr>
+          <w:rFonts w:eastAsia="MS Mincho"/>
+          <w:bCs/>
+          <w:lang w:eastAsia="ja-JP"/>
+        </w:rPr>
+        <w:t xml:space="preserve">), </w:t>
+      </w:r>
+      <w:proofErr w:type="spellStart"/>
+      <w:r>
+        <w:rPr>
+          <w:rFonts w:eastAsia="MS Mincho"/>
+          <w:bCs/>
+          <w:lang w:eastAsia="ja-JP"/>
+        </w:rPr>
+        <w:t>parentOf</w:t>
+      </w:r>
+      <w:proofErr w:type="spellEnd"/>
+      <w:r>
+        <w:rPr>
+          <w:rFonts w:eastAsia="MS Mincho"/>
+          <w:bCs/>
+          <w:lang w:eastAsia="ja-JP"/>
+        </w:rPr>
+        <w:t>(</w:t>
+      </w:r>
+      <w:proofErr w:type="spellStart"/>
+      <w:r>
+        <w:rPr>
+          <w:rFonts w:eastAsia="MS Mincho"/>
+          <w:bCs/>
+          <w:lang w:eastAsia="ja-JP"/>
+        </w:rPr>
+        <w:t>michelle</w:t>
+      </w:r>
+      <w:proofErr w:type="spellEnd"/>
+      <w:r>
+        <w:rPr>
+          <w:rFonts w:eastAsia="MS Mincho"/>
+          <w:bCs/>
+          <w:lang w:eastAsia="ja-JP"/>
+        </w:rPr>
+        <w:t xml:space="preserve">, </w:t>
+      </w:r>
+      <w:proofErr w:type="spellStart"/>
+      <w:r>
+        <w:rPr>
+          <w:rFonts w:eastAsia="MS Mincho"/>
+          <w:bCs/>
+          <w:lang w:eastAsia="ja-JP"/>
+        </w:rPr>
+        <w:t>natasha</w:t>
+      </w:r>
+      <w:proofErr w:type="spellEnd"/>
+      <w:r>
+        <w:rPr>
+          <w:rFonts w:eastAsia="MS Mincho"/>
+          <w:bCs/>
+          <w:lang w:eastAsia="ja-JP"/>
+        </w:rPr>
+        <w:t>), male(</w:t>
+      </w:r>
+      <w:proofErr w:type="spellStart"/>
+      <w:r>
+        <w:rPr>
+          <w:rFonts w:eastAsia="MS Mincho"/>
+          <w:bCs/>
+          <w:lang w:eastAsia="ja-JP"/>
+        </w:rPr>
+        <w:t>barack</w:t>
+      </w:r>
+      <w:proofErr w:type="spellEnd"/>
+      <w:r>
+        <w:rPr>
+          <w:rFonts w:eastAsia="MS Mincho"/>
+          <w:bCs/>
+          <w:lang w:eastAsia="ja-JP"/>
+        </w:rPr>
+        <w:t xml:space="preserve">), </w:t>
+      </w:r>
+      <w:proofErr w:type="spellStart"/>
+      <w:r>
+        <w:rPr>
+          <w:rFonts w:eastAsia="MS Mincho"/>
+          <w:bCs/>
+          <w:lang w:eastAsia="ja-JP"/>
+        </w:rPr>
+        <w:t>grandmotherOf</w:t>
+      </w:r>
+      <w:proofErr w:type="spellEnd"/>
+      <w:r>
+        <w:rPr>
+          <w:rFonts w:eastAsia="MS Mincho"/>
+          <w:bCs/>
+          <w:lang w:eastAsia="ja-JP"/>
+        </w:rPr>
+        <w:t>(</w:t>
+      </w:r>
+      <w:proofErr w:type="spellStart"/>
+      <w:r>
+        <w:rPr>
+          <w:rFonts w:eastAsia="MS Mincho"/>
+          <w:bCs/>
+          <w:lang w:eastAsia="ja-JP"/>
+        </w:rPr>
+        <w:t>marian</w:t>
+      </w:r>
+      <w:proofErr w:type="spellEnd"/>
+      <w:r>
+        <w:rPr>
+          <w:rFonts w:eastAsia="MS Mincho"/>
+          <w:bCs/>
+          <w:lang w:eastAsia="ja-JP"/>
+        </w:rPr>
+        <w:t xml:space="preserve">, </w:t>
+      </w:r>
+      <w:proofErr w:type="spellStart"/>
+      <w:r>
+        <w:rPr>
+          <w:rFonts w:eastAsia="MS Mincho"/>
+          <w:bCs/>
+          <w:lang w:eastAsia="ja-JP"/>
+        </w:rPr>
+        <w:t>malia</w:t>
+      </w:r>
+      <w:proofErr w:type="spellEnd"/>
+      <w:r>
+        <w:rPr>
+          <w:rFonts w:eastAsia="MS Mincho"/>
+          <w:bCs/>
+          <w:lang w:eastAsia="ja-JP"/>
+        </w:rPr>
+        <w:t xml:space="preserve">), </w:t>
+      </w:r>
+      <w:proofErr w:type="spellStart"/>
+      <w:r>
+        <w:rPr>
+          <w:rFonts w:eastAsia="MS Mincho"/>
+          <w:b/>
+          <w:lang w:eastAsia="ja-JP"/>
+        </w:rPr>
+        <w:t>grandmotherOf</w:t>
+      </w:r>
+      <w:proofErr w:type="spellEnd"/>
+      <w:r>
+        <w:rPr>
+          <w:rFonts w:eastAsia="MS Mincho"/>
+          <w:b/>
+          <w:lang w:eastAsia="ja-JP"/>
+        </w:rPr>
+        <w:t>(</w:t>
+      </w:r>
+      <w:proofErr w:type="spellStart"/>
+      <w:r>
+        <w:rPr>
+          <w:rFonts w:eastAsia="MS Mincho"/>
+          <w:b/>
+          <w:lang w:eastAsia="ja-JP"/>
+        </w:rPr>
+        <w:t>ann</w:t>
+      </w:r>
+      <w:proofErr w:type="spellEnd"/>
+      <w:r>
+        <w:rPr>
+          <w:rFonts w:eastAsia="MS Mincho"/>
+          <w:b/>
+          <w:lang w:eastAsia="ja-JP"/>
+        </w:rPr>
+        <w:t xml:space="preserve">, </w:t>
+      </w:r>
+      <w:proofErr w:type="spellStart"/>
+      <w:r>
+        <w:rPr>
+          <w:rFonts w:eastAsia="MS Mincho"/>
+          <w:b/>
+          <w:lang w:eastAsia="ja-JP"/>
+        </w:rPr>
+        <w:t>malia</w:t>
+      </w:r>
+      <w:proofErr w:type="spellEnd"/>
+      <w:r>
+        <w:rPr>
+          <w:rFonts w:eastAsia="MS Mincho"/>
+          <w:b/>
+          <w:lang w:eastAsia="ja-JP"/>
+        </w:rPr>
+        <w:t>)</w:t>
+      </w:r>
+      <w:r>
+        <w:rPr>
+          <w:rFonts w:eastAsia="MS Mincho"/>
+          <w:bCs/>
+          <w:lang w:eastAsia="ja-JP"/>
+        </w:rPr>
+        <w:t xml:space="preserve">, </w:t>
+      </w:r>
+      <w:proofErr w:type="spellStart"/>
+      <w:r>
+        <w:rPr>
+          <w:rFonts w:eastAsia="MS Mincho"/>
+          <w:bCs/>
+          <w:lang w:eastAsia="ja-JP"/>
+        </w:rPr>
+        <w:t>uncleOf</w:t>
+      </w:r>
+      <w:proofErr w:type="spellEnd"/>
+      <w:r>
+        <w:rPr>
+          <w:rFonts w:eastAsia="MS Mincho"/>
+          <w:bCs/>
+          <w:lang w:eastAsia="ja-JP"/>
+        </w:rPr>
+        <w:t xml:space="preserve">(craig, </w:t>
+      </w:r>
+      <w:proofErr w:type="spellStart"/>
+      <w:r>
+        <w:rPr>
+          <w:rFonts w:eastAsia="MS Mincho"/>
+          <w:bCs/>
+          <w:lang w:eastAsia="ja-JP"/>
+        </w:rPr>
+        <w:t>malia</w:t>
+      </w:r>
+      <w:proofErr w:type="spellEnd"/>
+      <w:r>
+        <w:rPr>
+          <w:rFonts w:eastAsia="MS Mincho"/>
+          <w:bCs/>
+          <w:lang w:eastAsia="ja-JP"/>
+        </w:rPr>
+        <w:t xml:space="preserve">), </w:t>
+      </w:r>
+      <w:proofErr w:type="spellStart"/>
+      <w:r>
+        <w:rPr>
+          <w:rFonts w:eastAsia="MS Mincho"/>
+          <w:bCs/>
+          <w:lang w:eastAsia="ja-JP"/>
+        </w:rPr>
+        <w:t>uncleOf</w:t>
+      </w:r>
+      <w:proofErr w:type="spellEnd"/>
+      <w:r>
+        <w:rPr>
+          <w:rFonts w:eastAsia="MS Mincho"/>
+          <w:bCs/>
+          <w:lang w:eastAsia="ja-JP"/>
+        </w:rPr>
+        <w:t xml:space="preserve">(craig, </w:t>
+      </w:r>
+      <w:proofErr w:type="spellStart"/>
+      <w:r>
+        <w:rPr>
+          <w:rFonts w:eastAsia="MS Mincho"/>
+          <w:bCs/>
+          <w:lang w:eastAsia="ja-JP"/>
+        </w:rPr>
+        <w:t>natasha</w:t>
+      </w:r>
+      <w:proofErr w:type="spellEnd"/>
+      <w:r>
+        <w:rPr>
+          <w:rFonts w:eastAsia="MS Mincho"/>
+          <w:bCs/>
+          <w:lang w:eastAsia="ja-JP"/>
+        </w:rPr>
+        <w:t>)}</w:t>
+      </w:r>
+      <w:r>
+        <w:rPr>
+          <w:rFonts w:eastAsia="MS Mincho"/>
+          <w:bCs/>
+          <w:lang w:eastAsia="ja-JP"/>
+        </w:rPr>
+        <w:br/>
+        <w:t xml:space="preserve">Since </w:t>
+      </w:r>
+      <w:proofErr w:type="spellStart"/>
+      <w:r>
+        <w:rPr>
+          <w:rFonts w:eastAsia="MS Mincho"/>
+          <w:bCs/>
+          <w:lang w:eastAsia="ja-JP"/>
+        </w:rPr>
+        <w:t>grandmotherOf</w:t>
+      </w:r>
+      <w:proofErr w:type="spellEnd"/>
+      <w:r>
+        <w:rPr>
+          <w:rFonts w:eastAsia="MS Mincho"/>
+          <w:bCs/>
+          <w:lang w:eastAsia="ja-JP"/>
+        </w:rPr>
+        <w:t>(</w:t>
+      </w:r>
+      <w:proofErr w:type="spellStart"/>
+      <w:r>
+        <w:rPr>
+          <w:rFonts w:eastAsia="MS Mincho"/>
+          <w:bCs/>
+          <w:lang w:eastAsia="ja-JP"/>
+        </w:rPr>
+        <w:t>ann</w:t>
+      </w:r>
+      <w:proofErr w:type="spellEnd"/>
+      <w:r>
+        <w:rPr>
+          <w:rFonts w:eastAsia="MS Mincho"/>
+          <w:bCs/>
+          <w:lang w:eastAsia="ja-JP"/>
+        </w:rPr>
+        <w:t xml:space="preserve">, </w:t>
+      </w:r>
+      <w:proofErr w:type="spellStart"/>
+      <w:r>
+        <w:rPr>
+          <w:rFonts w:eastAsia="MS Mincho"/>
+          <w:bCs/>
+          <w:lang w:eastAsia="ja-JP"/>
+        </w:rPr>
+        <w:t>malia</w:t>
+      </w:r>
+      <w:proofErr w:type="spellEnd"/>
+      <w:r>
+        <w:rPr>
+          <w:rFonts w:eastAsia="MS Mincho"/>
+          <w:bCs/>
+          <w:lang w:eastAsia="ja-JP"/>
+        </w:rPr>
+        <w:t xml:space="preserve">) has been shown to be an element of </w:t>
+      </w:r>
+      <w:r>
+        <w:rPr>
+          <w:rFonts w:eastAsia="MS Mincho"/>
+          <w:bCs/>
+          <w:lang w:eastAsia="ja-JP"/>
+        </w:rPr>
+        <w:t>T P ↑ ω</w:t>
+      </w:r>
+      <w:r>
+        <w:rPr>
+          <w:rFonts w:eastAsia="MS Mincho"/>
+          <w:bCs/>
+          <w:lang w:eastAsia="ja-JP"/>
+        </w:rPr>
+        <w:t xml:space="preserve">, the </w:t>
+      </w:r>
+      <w:proofErr w:type="spellStart"/>
+      <w:r>
+        <w:rPr>
+          <w:rFonts w:eastAsia="MS Mincho"/>
+          <w:bCs/>
+          <w:lang w:eastAsia="ja-JP"/>
+        </w:rPr>
+        <w:t>Datalog</w:t>
+      </w:r>
+      <w:proofErr w:type="spellEnd"/>
+      <w:r>
+        <w:rPr>
+          <w:rFonts w:eastAsia="MS Mincho"/>
+          <w:bCs/>
+          <w:lang w:eastAsia="ja-JP"/>
+        </w:rPr>
+        <w:t xml:space="preserve"> program Herbrand-entails it.</w:t>
       </w:r>
     </w:p>
     <w:sectPr>

</xml_diff>